<commit_message>
Perform Functional Testing on OrangeHRM
This commit includes a detailed functional testing report for the OrangeHRM open-source demo web application.
</commit_message>
<xml_diff>
--- a/Week2_ManualTesting.docx
+++ b/Week2_ManualTesting.docx
@@ -3193,17 +3193,18 @@
       <w:bookmarkEnd w:id="2"/>
       <w:r>
         <w:rPr>
-          <w:color w:val="000000"/>
-          <w:rtl w:val="0"/>
-        </w:rPr>
-        <w:t xml:space="preserve"> S</w:t>
-      </w:r>
-      <w:r>
-        <w:rPr>
-          <w:color w:val="000000"/>
-          <w:rtl w:val="0"/>
-        </w:rPr>
-        <w:t xml:space="preserve">everity vs Priority</w:t>
+          <w:color w:val="1155cc"/>
+          <w:rtl w:val="0"/>
+        </w:rPr>
+        <w:t xml:space="preserve"> </w:t>
+      </w:r>
+      <w:r>
+        <w:rPr>
+          <w:b w:val="1"/>
+          <w:color w:val="1155cc"/>
+          <w:rtl w:val="0"/>
+        </w:rPr>
+        <w:t xml:space="preserve">Severity vs Priority</w:t>
       </w:r>
       <w:r>
         <w:pict>
@@ -3744,6 +3745,2721 @@
         <w:t xml:space="preserve"> Can be fixed later or included in future updates.</w:t>
       </w:r>
     </w:p>
+    <w:p>
+      <w:pPr>
+        <w:rPr/>
+      </w:pPr>
+      <w:r>
+        <w:rPr>
+          <w:rtl w:val="0"/>
+        </w:rPr>
+      </w:r>
+    </w:p>
+    <w:p>
+      <w:pPr>
+        <w:rPr/>
+      </w:pPr>
+      <w:r>
+        <w:rPr>
+          <w:rtl w:val="0"/>
+        </w:rPr>
+      </w:r>
+    </w:p>
+    <w:p>
+      <w:pPr>
+        <w:rPr/>
+      </w:pPr>
+      <w:r>
+        <w:rPr>
+          <w:rtl w:val="0"/>
+        </w:rPr>
+      </w:r>
+    </w:p>
+    <w:p>
+      <w:pPr>
+        <w:rPr/>
+      </w:pPr>
+      <w:r>
+        <w:rPr>
+          <w:rtl w:val="0"/>
+        </w:rPr>
+      </w:r>
+    </w:p>
+    <w:p>
+      <w:pPr>
+        <w:rPr/>
+      </w:pPr>
+      <w:r>
+        <w:rPr>
+          <w:rtl w:val="0"/>
+        </w:rPr>
+      </w:r>
+    </w:p>
+    <w:p>
+      <w:pPr>
+        <w:pStyle w:val="Heading3"/>
+        <w:rPr>
+          <w:color w:val="000000"/>
+          <w:sz w:val="22"/>
+          <w:szCs w:val="22"/>
+        </w:rPr>
+      </w:pPr>
+      <w:bookmarkStart w:colFirst="0" w:colLast="0" w:name="_hy3utlsw3x51" w:id="6"/>
+      <w:bookmarkEnd w:id="6"/>
+      <w:r>
+        <w:rPr>
+          <w:b w:val="1"/>
+          <w:color w:val="1155cc"/>
+          <w:rtl w:val="0"/>
+        </w:rPr>
+        <w:t xml:space="preserve"> Functional Testing of OrangeHRM</w:t>
+      </w:r>
+      <w:r>
+        <w:pict>
+          <v:rect style="width:0.0pt;height:1.5pt" o:hr="t" o:hrstd="t" o:hralign="center" fillcolor="#A0A0A0" stroked="f"/>
+        </w:pict>
+      </w:r>
+      <w:r>
+        <w:rPr>
+          <w:rtl w:val="0"/>
+        </w:rPr>
+      </w:r>
+    </w:p>
+    <w:p>
+      <w:pPr>
+        <w:rPr/>
+      </w:pPr>
+      <w:r>
+        <w:rPr>
+          <w:rtl w:val="0"/>
+        </w:rPr>
+      </w:r>
+    </w:p>
+    <w:p>
+      <w:pPr>
+        <w:rPr/>
+      </w:pPr>
+      <w:r>
+        <w:rPr>
+          <w:rtl w:val="0"/>
+        </w:rPr>
+      </w:r>
+    </w:p>
+    <w:tbl>
+      <w:tblPr>
+        <w:tblStyle w:val="Table2"/>
+        <w:tblW w:w="9025.511811023624" w:type="dxa"/>
+        <w:jc w:val="left"/>
+        <w:tblBorders>
+          <w:top w:color="000000" w:space="0" w:sz="8" w:val="single"/>
+          <w:left w:color="000000" w:space="0" w:sz="8" w:val="single"/>
+          <w:bottom w:color="000000" w:space="0" w:sz="8" w:val="single"/>
+          <w:right w:color="000000" w:space="0" w:sz="8" w:val="single"/>
+          <w:insideH w:color="000000" w:space="0" w:sz="8" w:val="single"/>
+          <w:insideV w:color="000000" w:space="0" w:sz="8" w:val="single"/>
+        </w:tblBorders>
+        <w:tblLayout w:type="fixed"/>
+        <w:tblLook w:val="0600"/>
+      </w:tblPr>
+      <w:tblGrid>
+        <w:gridCol w:w="805.0926028612622"/>
+        <w:gridCol w:w="1257.0744149939005"/>
+        <w:gridCol w:w="1511.3141843185097"/>
+        <w:gridCol w:w="2118.6647443717425"/>
+        <w:gridCol w:w="1666.682932239104"/>
+        <w:gridCol w:w="1666.682932239104"/>
+        <w:tblGridChange w:id="0">
+          <w:tblGrid>
+            <w:gridCol w:w="805.0926028612622"/>
+            <w:gridCol w:w="1257.0744149939005"/>
+            <w:gridCol w:w="1511.3141843185097"/>
+            <w:gridCol w:w="2118.6647443717425"/>
+            <w:gridCol w:w="1666.682932239104"/>
+            <w:gridCol w:w="1666.682932239104"/>
+          </w:tblGrid>
+        </w:tblGridChange>
+      </w:tblGrid>
+      <w:tr>
+        <w:trPr>
+          <w:cantSplit w:val="0"/>
+          <w:tblHeader w:val="0"/>
+        </w:trPr>
+        <w:tc>
+          <w:tcPr>
+            <w:shd w:fill="auto" w:val="clear"/>
+            <w:tcMar>
+              <w:top w:w="100.0" w:type="dxa"/>
+              <w:left w:w="100.0" w:type="dxa"/>
+              <w:bottom w:w="100.0" w:type="dxa"/>
+              <w:right w:w="100.0" w:type="dxa"/>
+            </w:tcMar>
+            <w:vAlign w:val="top"/>
+          </w:tcPr>
+          <w:p>
+            <w:pPr>
+              <w:keepNext w:val="0"/>
+              <w:keepLines w:val="0"/>
+              <w:pageBreakBefore w:val="0"/>
+              <w:widowControl w:val="0"/>
+              <w:pBdr>
+                <w:top w:space="0" w:sz="0" w:val="nil"/>
+                <w:left w:space="0" w:sz="0" w:val="nil"/>
+                <w:bottom w:space="0" w:sz="0" w:val="nil"/>
+                <w:right w:space="0" w:sz="0" w:val="nil"/>
+                <w:between w:space="0" w:sz="0" w:val="nil"/>
+              </w:pBdr>
+              <w:shd w:fill="auto" w:val="clear"/>
+              <w:spacing w:after="0" w:before="0" w:line="240" w:lineRule="auto"/>
+              <w:ind w:left="0" w:right="0" w:firstLine="0"/>
+              <w:jc w:val="left"/>
+              <w:rPr/>
+            </w:pPr>
+            <w:r>
+              <w:rPr>
+                <w:rtl w:val="0"/>
+              </w:rPr>
+              <w:t xml:space="preserve">ID</w:t>
+            </w:r>
+          </w:p>
+        </w:tc>
+        <w:tc>
+          <w:tcPr>
+            <w:shd w:fill="auto" w:val="clear"/>
+            <w:tcMar>
+              <w:top w:w="100.0" w:type="dxa"/>
+              <w:left w:w="100.0" w:type="dxa"/>
+              <w:bottom w:w="100.0" w:type="dxa"/>
+              <w:right w:w="100.0" w:type="dxa"/>
+            </w:tcMar>
+            <w:vAlign w:val="top"/>
+          </w:tcPr>
+          <w:p>
+            <w:pPr>
+              <w:keepNext w:val="0"/>
+              <w:keepLines w:val="0"/>
+              <w:pageBreakBefore w:val="0"/>
+              <w:widowControl w:val="0"/>
+              <w:pBdr>
+                <w:top w:space="0" w:sz="0" w:val="nil"/>
+                <w:left w:space="0" w:sz="0" w:val="nil"/>
+                <w:bottom w:space="0" w:sz="0" w:val="nil"/>
+                <w:right w:space="0" w:sz="0" w:val="nil"/>
+                <w:between w:space="0" w:sz="0" w:val="nil"/>
+              </w:pBdr>
+              <w:shd w:fill="auto" w:val="clear"/>
+              <w:spacing w:after="0" w:before="0" w:line="240" w:lineRule="auto"/>
+              <w:ind w:left="0" w:right="0" w:firstLine="0"/>
+              <w:jc w:val="left"/>
+              <w:rPr/>
+            </w:pPr>
+            <w:r>
+              <w:rPr>
+                <w:rtl w:val="0"/>
+              </w:rPr>
+              <w:t xml:space="preserve">Module</w:t>
+            </w:r>
+          </w:p>
+        </w:tc>
+        <w:tc>
+          <w:tcPr>
+            <w:shd w:fill="auto" w:val="clear"/>
+            <w:tcMar>
+              <w:top w:w="100.0" w:type="dxa"/>
+              <w:left w:w="100.0" w:type="dxa"/>
+              <w:bottom w:w="100.0" w:type="dxa"/>
+              <w:right w:w="100.0" w:type="dxa"/>
+            </w:tcMar>
+            <w:vAlign w:val="top"/>
+          </w:tcPr>
+          <w:p>
+            <w:pPr>
+              <w:keepNext w:val="0"/>
+              <w:keepLines w:val="0"/>
+              <w:pageBreakBefore w:val="0"/>
+              <w:widowControl w:val="0"/>
+              <w:pBdr>
+                <w:top w:space="0" w:sz="0" w:val="nil"/>
+                <w:left w:space="0" w:sz="0" w:val="nil"/>
+                <w:bottom w:space="0" w:sz="0" w:val="nil"/>
+                <w:right w:space="0" w:sz="0" w:val="nil"/>
+                <w:between w:space="0" w:sz="0" w:val="nil"/>
+              </w:pBdr>
+              <w:shd w:fill="auto" w:val="clear"/>
+              <w:spacing w:after="0" w:before="0" w:line="240" w:lineRule="auto"/>
+              <w:ind w:left="0" w:right="0" w:firstLine="0"/>
+              <w:jc w:val="left"/>
+              <w:rPr/>
+            </w:pPr>
+            <w:r>
+              <w:rPr>
+                <w:rtl w:val="0"/>
+              </w:rPr>
+              <w:t xml:space="preserve">Title</w:t>
+            </w:r>
+          </w:p>
+        </w:tc>
+        <w:tc>
+          <w:tcPr>
+            <w:shd w:fill="auto" w:val="clear"/>
+            <w:tcMar>
+              <w:top w:w="100.0" w:type="dxa"/>
+              <w:left w:w="100.0" w:type="dxa"/>
+              <w:bottom w:w="100.0" w:type="dxa"/>
+              <w:right w:w="100.0" w:type="dxa"/>
+            </w:tcMar>
+            <w:vAlign w:val="top"/>
+          </w:tcPr>
+          <w:p>
+            <w:pPr>
+              <w:keepNext w:val="0"/>
+              <w:keepLines w:val="0"/>
+              <w:pageBreakBefore w:val="0"/>
+              <w:widowControl w:val="0"/>
+              <w:pBdr>
+                <w:top w:space="0" w:sz="0" w:val="nil"/>
+                <w:left w:space="0" w:sz="0" w:val="nil"/>
+                <w:bottom w:space="0" w:sz="0" w:val="nil"/>
+                <w:right w:space="0" w:sz="0" w:val="nil"/>
+                <w:between w:space="0" w:sz="0" w:val="nil"/>
+              </w:pBdr>
+              <w:shd w:fill="auto" w:val="clear"/>
+              <w:spacing w:after="0" w:before="0" w:line="240" w:lineRule="auto"/>
+              <w:ind w:left="0" w:right="0" w:firstLine="0"/>
+              <w:jc w:val="left"/>
+              <w:rPr/>
+            </w:pPr>
+            <w:r>
+              <w:rPr>
+                <w:rtl w:val="0"/>
+              </w:rPr>
+              <w:t xml:space="preserve">Test Steps</w:t>
+            </w:r>
+          </w:p>
+        </w:tc>
+        <w:tc>
+          <w:tcPr>
+            <w:shd w:fill="auto" w:val="clear"/>
+            <w:tcMar>
+              <w:top w:w="100.0" w:type="dxa"/>
+              <w:left w:w="100.0" w:type="dxa"/>
+              <w:bottom w:w="100.0" w:type="dxa"/>
+              <w:right w:w="100.0" w:type="dxa"/>
+            </w:tcMar>
+            <w:vAlign w:val="top"/>
+          </w:tcPr>
+          <w:p>
+            <w:pPr>
+              <w:keepNext w:val="0"/>
+              <w:keepLines w:val="0"/>
+              <w:pageBreakBefore w:val="0"/>
+              <w:widowControl w:val="0"/>
+              <w:pBdr>
+                <w:top w:space="0" w:sz="0" w:val="nil"/>
+                <w:left w:space="0" w:sz="0" w:val="nil"/>
+                <w:bottom w:space="0" w:sz="0" w:val="nil"/>
+                <w:right w:space="0" w:sz="0" w:val="nil"/>
+                <w:between w:space="0" w:sz="0" w:val="nil"/>
+              </w:pBdr>
+              <w:shd w:fill="auto" w:val="clear"/>
+              <w:spacing w:after="0" w:before="0" w:line="240" w:lineRule="auto"/>
+              <w:ind w:left="0" w:right="0" w:firstLine="0"/>
+              <w:jc w:val="left"/>
+              <w:rPr/>
+            </w:pPr>
+            <w:r>
+              <w:rPr>
+                <w:rtl w:val="0"/>
+              </w:rPr>
+              <w:t xml:space="preserve">Expected Result</w:t>
+            </w:r>
+          </w:p>
+        </w:tc>
+        <w:tc>
+          <w:tcPr>
+            <w:shd w:fill="auto" w:val="clear"/>
+            <w:tcMar>
+              <w:top w:w="100.0" w:type="dxa"/>
+              <w:left w:w="100.0" w:type="dxa"/>
+              <w:bottom w:w="100.0" w:type="dxa"/>
+              <w:right w:w="100.0" w:type="dxa"/>
+            </w:tcMar>
+            <w:vAlign w:val="top"/>
+          </w:tcPr>
+          <w:p>
+            <w:pPr>
+              <w:keepNext w:val="0"/>
+              <w:keepLines w:val="0"/>
+              <w:pageBreakBefore w:val="0"/>
+              <w:widowControl w:val="0"/>
+              <w:pBdr>
+                <w:top w:space="0" w:sz="0" w:val="nil"/>
+                <w:left w:space="0" w:sz="0" w:val="nil"/>
+                <w:bottom w:space="0" w:sz="0" w:val="nil"/>
+                <w:right w:space="0" w:sz="0" w:val="nil"/>
+                <w:between w:space="0" w:sz="0" w:val="nil"/>
+              </w:pBdr>
+              <w:shd w:fill="auto" w:val="clear"/>
+              <w:spacing w:after="0" w:before="0" w:line="240" w:lineRule="auto"/>
+              <w:ind w:left="0" w:right="0" w:firstLine="0"/>
+              <w:jc w:val="left"/>
+              <w:rPr/>
+            </w:pPr>
+            <w:r>
+              <w:rPr>
+                <w:rtl w:val="0"/>
+              </w:rPr>
+              <w:t xml:space="preserve">Actual Result</w:t>
+            </w:r>
+          </w:p>
+        </w:tc>
+      </w:tr>
+      <w:tr>
+        <w:trPr>
+          <w:cantSplit w:val="0"/>
+          <w:tblHeader w:val="0"/>
+        </w:trPr>
+        <w:tc>
+          <w:tcPr>
+            <w:shd w:fill="auto" w:val="clear"/>
+            <w:tcMar>
+              <w:top w:w="100.0" w:type="dxa"/>
+              <w:left w:w="100.0" w:type="dxa"/>
+              <w:bottom w:w="100.0" w:type="dxa"/>
+              <w:right w:w="100.0" w:type="dxa"/>
+            </w:tcMar>
+            <w:vAlign w:val="top"/>
+          </w:tcPr>
+          <w:p>
+            <w:pPr>
+              <w:keepNext w:val="0"/>
+              <w:keepLines w:val="0"/>
+              <w:pageBreakBefore w:val="0"/>
+              <w:widowControl w:val="0"/>
+              <w:pBdr>
+                <w:top w:space="0" w:sz="0" w:val="nil"/>
+                <w:left w:space="0" w:sz="0" w:val="nil"/>
+                <w:bottom w:space="0" w:sz="0" w:val="nil"/>
+                <w:right w:space="0" w:sz="0" w:val="nil"/>
+                <w:between w:space="0" w:sz="0" w:val="nil"/>
+              </w:pBdr>
+              <w:shd w:fill="auto" w:val="clear"/>
+              <w:spacing w:after="0" w:before="0" w:line="240" w:lineRule="auto"/>
+              <w:ind w:left="0" w:right="0" w:firstLine="0"/>
+              <w:jc w:val="left"/>
+              <w:rPr/>
+            </w:pPr>
+            <w:r>
+              <w:rPr>
+                <w:rtl w:val="0"/>
+              </w:rPr>
+              <w:t xml:space="preserve">TC1</w:t>
+            </w:r>
+          </w:p>
+        </w:tc>
+        <w:tc>
+          <w:tcPr>
+            <w:shd w:fill="auto" w:val="clear"/>
+            <w:tcMar>
+              <w:top w:w="100.0" w:type="dxa"/>
+              <w:left w:w="100.0" w:type="dxa"/>
+              <w:bottom w:w="100.0" w:type="dxa"/>
+              <w:right w:w="100.0" w:type="dxa"/>
+            </w:tcMar>
+            <w:vAlign w:val="top"/>
+          </w:tcPr>
+          <w:p>
+            <w:pPr>
+              <w:keepNext w:val="0"/>
+              <w:keepLines w:val="0"/>
+              <w:pageBreakBefore w:val="0"/>
+              <w:widowControl w:val="0"/>
+              <w:pBdr>
+                <w:top w:space="0" w:sz="0" w:val="nil"/>
+                <w:left w:space="0" w:sz="0" w:val="nil"/>
+                <w:bottom w:space="0" w:sz="0" w:val="nil"/>
+                <w:right w:space="0" w:sz="0" w:val="nil"/>
+                <w:between w:space="0" w:sz="0" w:val="nil"/>
+              </w:pBdr>
+              <w:shd w:fill="auto" w:val="clear"/>
+              <w:spacing w:after="0" w:before="0" w:line="240" w:lineRule="auto"/>
+              <w:ind w:left="0" w:right="0" w:firstLine="0"/>
+              <w:jc w:val="left"/>
+              <w:rPr/>
+            </w:pPr>
+            <w:r>
+              <w:rPr>
+                <w:rtl w:val="0"/>
+              </w:rPr>
+              <w:t xml:space="preserve">Login</w:t>
+            </w:r>
+          </w:p>
+        </w:tc>
+        <w:tc>
+          <w:tcPr>
+            <w:shd w:fill="auto" w:val="clear"/>
+            <w:tcMar>
+              <w:top w:w="100.0" w:type="dxa"/>
+              <w:left w:w="100.0" w:type="dxa"/>
+              <w:bottom w:w="100.0" w:type="dxa"/>
+              <w:right w:w="100.0" w:type="dxa"/>
+            </w:tcMar>
+            <w:vAlign w:val="top"/>
+          </w:tcPr>
+          <w:p>
+            <w:pPr>
+              <w:keepNext w:val="0"/>
+              <w:keepLines w:val="0"/>
+              <w:pageBreakBefore w:val="0"/>
+              <w:widowControl w:val="0"/>
+              <w:pBdr>
+                <w:top w:space="0" w:sz="0" w:val="nil"/>
+                <w:left w:space="0" w:sz="0" w:val="nil"/>
+                <w:bottom w:space="0" w:sz="0" w:val="nil"/>
+                <w:right w:space="0" w:sz="0" w:val="nil"/>
+                <w:between w:space="0" w:sz="0" w:val="nil"/>
+              </w:pBdr>
+              <w:shd w:fill="auto" w:val="clear"/>
+              <w:spacing w:after="0" w:before="0" w:line="240" w:lineRule="auto"/>
+              <w:ind w:left="0" w:right="0" w:firstLine="0"/>
+              <w:jc w:val="left"/>
+              <w:rPr/>
+            </w:pPr>
+            <w:r>
+              <w:rPr>
+                <w:rtl w:val="0"/>
+              </w:rPr>
+              <w:t xml:space="preserve">Valid login</w:t>
+            </w:r>
+          </w:p>
+        </w:tc>
+        <w:tc>
+          <w:tcPr>
+            <w:shd w:fill="auto" w:val="clear"/>
+            <w:tcMar>
+              <w:top w:w="100.0" w:type="dxa"/>
+              <w:left w:w="100.0" w:type="dxa"/>
+              <w:bottom w:w="100.0" w:type="dxa"/>
+              <w:right w:w="100.0" w:type="dxa"/>
+            </w:tcMar>
+            <w:vAlign w:val="top"/>
+          </w:tcPr>
+          <w:p>
+            <w:pPr>
+              <w:keepNext w:val="0"/>
+              <w:keepLines w:val="0"/>
+              <w:pageBreakBefore w:val="0"/>
+              <w:widowControl w:val="0"/>
+              <w:pBdr>
+                <w:top w:space="0" w:sz="0" w:val="nil"/>
+                <w:left w:space="0" w:sz="0" w:val="nil"/>
+                <w:bottom w:space="0" w:sz="0" w:val="nil"/>
+                <w:right w:space="0" w:sz="0" w:val="nil"/>
+                <w:between w:space="0" w:sz="0" w:val="nil"/>
+              </w:pBdr>
+              <w:shd w:fill="auto" w:val="clear"/>
+              <w:spacing w:after="0" w:before="0" w:line="240" w:lineRule="auto"/>
+              <w:ind w:left="0" w:right="0" w:firstLine="0"/>
+              <w:jc w:val="left"/>
+              <w:rPr/>
+            </w:pPr>
+            <w:r>
+              <w:rPr>
+                <w:rtl w:val="0"/>
+              </w:rPr>
+              <w:t xml:space="preserve">1.Enter Admin/admin123</w:t>
+            </w:r>
+          </w:p>
+          <w:p>
+            <w:pPr>
+              <w:keepNext w:val="0"/>
+              <w:keepLines w:val="0"/>
+              <w:pageBreakBefore w:val="0"/>
+              <w:widowControl w:val="0"/>
+              <w:pBdr>
+                <w:top w:space="0" w:sz="0" w:val="nil"/>
+                <w:left w:space="0" w:sz="0" w:val="nil"/>
+                <w:bottom w:space="0" w:sz="0" w:val="nil"/>
+                <w:right w:space="0" w:sz="0" w:val="nil"/>
+                <w:between w:space="0" w:sz="0" w:val="nil"/>
+              </w:pBdr>
+              <w:shd w:fill="auto" w:val="clear"/>
+              <w:spacing w:after="0" w:before="0" w:line="240" w:lineRule="auto"/>
+              <w:ind w:left="0" w:right="0" w:firstLine="0"/>
+              <w:jc w:val="left"/>
+              <w:rPr/>
+            </w:pPr>
+            <w:r>
+              <w:rPr>
+                <w:rtl w:val="0"/>
+              </w:rPr>
+              <w:t xml:space="preserve">2.click “Login”</w:t>
+            </w:r>
+          </w:p>
+        </w:tc>
+        <w:tc>
+          <w:tcPr>
+            <w:shd w:fill="auto" w:val="clear"/>
+            <w:tcMar>
+              <w:top w:w="100.0" w:type="dxa"/>
+              <w:left w:w="100.0" w:type="dxa"/>
+              <w:bottom w:w="100.0" w:type="dxa"/>
+              <w:right w:w="100.0" w:type="dxa"/>
+            </w:tcMar>
+            <w:vAlign w:val="top"/>
+          </w:tcPr>
+          <w:p>
+            <w:pPr>
+              <w:keepNext w:val="0"/>
+              <w:keepLines w:val="0"/>
+              <w:pageBreakBefore w:val="0"/>
+              <w:widowControl w:val="0"/>
+              <w:pBdr>
+                <w:top w:space="0" w:sz="0" w:val="nil"/>
+                <w:left w:space="0" w:sz="0" w:val="nil"/>
+                <w:bottom w:space="0" w:sz="0" w:val="nil"/>
+                <w:right w:space="0" w:sz="0" w:val="nil"/>
+                <w:between w:space="0" w:sz="0" w:val="nil"/>
+              </w:pBdr>
+              <w:shd w:fill="auto" w:val="clear"/>
+              <w:spacing w:after="0" w:before="0" w:line="240" w:lineRule="auto"/>
+              <w:ind w:left="0" w:right="0" w:firstLine="0"/>
+              <w:jc w:val="left"/>
+              <w:rPr/>
+            </w:pPr>
+            <w:r>
+              <w:rPr>
+                <w:rtl w:val="0"/>
+              </w:rPr>
+              <w:t xml:space="preserve">Successfully login</w:t>
+            </w:r>
+          </w:p>
+        </w:tc>
+        <w:tc>
+          <w:tcPr>
+            <w:shd w:fill="auto" w:val="clear"/>
+            <w:tcMar>
+              <w:top w:w="100.0" w:type="dxa"/>
+              <w:left w:w="100.0" w:type="dxa"/>
+              <w:bottom w:w="100.0" w:type="dxa"/>
+              <w:right w:w="100.0" w:type="dxa"/>
+            </w:tcMar>
+            <w:vAlign w:val="top"/>
+          </w:tcPr>
+          <w:p>
+            <w:pPr>
+              <w:keepNext w:val="0"/>
+              <w:keepLines w:val="0"/>
+              <w:pageBreakBefore w:val="0"/>
+              <w:widowControl w:val="0"/>
+              <w:pBdr>
+                <w:top w:space="0" w:sz="0" w:val="nil"/>
+                <w:left w:space="0" w:sz="0" w:val="nil"/>
+                <w:bottom w:space="0" w:sz="0" w:val="nil"/>
+                <w:right w:space="0" w:sz="0" w:val="nil"/>
+                <w:between w:space="0" w:sz="0" w:val="nil"/>
+              </w:pBdr>
+              <w:shd w:fill="auto" w:val="clear"/>
+              <w:spacing w:after="0" w:before="0" w:line="240" w:lineRule="auto"/>
+              <w:ind w:left="0" w:right="0" w:firstLine="0"/>
+              <w:jc w:val="left"/>
+              <w:rPr/>
+            </w:pPr>
+            <w:r>
+              <w:rPr>
+                <w:rtl w:val="0"/>
+              </w:rPr>
+              <w:t xml:space="preserve">Successfully login</w:t>
+            </w:r>
+          </w:p>
+        </w:tc>
+      </w:tr>
+      <w:tr>
+        <w:trPr>
+          <w:cantSplit w:val="0"/>
+          <w:tblHeader w:val="0"/>
+        </w:trPr>
+        <w:tc>
+          <w:tcPr>
+            <w:shd w:fill="auto" w:val="clear"/>
+            <w:tcMar>
+              <w:top w:w="100.0" w:type="dxa"/>
+              <w:left w:w="100.0" w:type="dxa"/>
+              <w:bottom w:w="100.0" w:type="dxa"/>
+              <w:right w:w="100.0" w:type="dxa"/>
+            </w:tcMar>
+            <w:vAlign w:val="top"/>
+          </w:tcPr>
+          <w:p>
+            <w:pPr>
+              <w:keepNext w:val="0"/>
+              <w:keepLines w:val="0"/>
+              <w:pageBreakBefore w:val="0"/>
+              <w:widowControl w:val="0"/>
+              <w:pBdr>
+                <w:top w:space="0" w:sz="0" w:val="nil"/>
+                <w:left w:space="0" w:sz="0" w:val="nil"/>
+                <w:bottom w:space="0" w:sz="0" w:val="nil"/>
+                <w:right w:space="0" w:sz="0" w:val="nil"/>
+                <w:between w:space="0" w:sz="0" w:val="nil"/>
+              </w:pBdr>
+              <w:shd w:fill="auto" w:val="clear"/>
+              <w:spacing w:after="0" w:before="0" w:line="240" w:lineRule="auto"/>
+              <w:ind w:left="0" w:right="0" w:firstLine="0"/>
+              <w:jc w:val="left"/>
+              <w:rPr/>
+            </w:pPr>
+            <w:r>
+              <w:rPr>
+                <w:rtl w:val="0"/>
+              </w:rPr>
+              <w:t xml:space="preserve">TC2</w:t>
+            </w:r>
+          </w:p>
+        </w:tc>
+        <w:tc>
+          <w:tcPr>
+            <w:shd w:fill="auto" w:val="clear"/>
+            <w:tcMar>
+              <w:top w:w="100.0" w:type="dxa"/>
+              <w:left w:w="100.0" w:type="dxa"/>
+              <w:bottom w:w="100.0" w:type="dxa"/>
+              <w:right w:w="100.0" w:type="dxa"/>
+            </w:tcMar>
+            <w:vAlign w:val="top"/>
+          </w:tcPr>
+          <w:p>
+            <w:pPr>
+              <w:keepNext w:val="0"/>
+              <w:keepLines w:val="0"/>
+              <w:pageBreakBefore w:val="0"/>
+              <w:widowControl w:val="0"/>
+              <w:pBdr>
+                <w:top w:space="0" w:sz="0" w:val="nil"/>
+                <w:left w:space="0" w:sz="0" w:val="nil"/>
+                <w:bottom w:space="0" w:sz="0" w:val="nil"/>
+                <w:right w:space="0" w:sz="0" w:val="nil"/>
+                <w:between w:space="0" w:sz="0" w:val="nil"/>
+              </w:pBdr>
+              <w:shd w:fill="auto" w:val="clear"/>
+              <w:spacing w:after="0" w:before="0" w:line="240" w:lineRule="auto"/>
+              <w:ind w:left="0" w:right="0" w:firstLine="0"/>
+              <w:jc w:val="left"/>
+              <w:rPr/>
+            </w:pPr>
+            <w:r>
+              <w:rPr>
+                <w:rtl w:val="0"/>
+              </w:rPr>
+              <w:t xml:space="preserve">Login</w:t>
+            </w:r>
+          </w:p>
+        </w:tc>
+        <w:tc>
+          <w:tcPr>
+            <w:shd w:fill="auto" w:val="clear"/>
+            <w:tcMar>
+              <w:top w:w="100.0" w:type="dxa"/>
+              <w:left w:w="100.0" w:type="dxa"/>
+              <w:bottom w:w="100.0" w:type="dxa"/>
+              <w:right w:w="100.0" w:type="dxa"/>
+            </w:tcMar>
+            <w:vAlign w:val="top"/>
+          </w:tcPr>
+          <w:p>
+            <w:pPr>
+              <w:keepNext w:val="0"/>
+              <w:keepLines w:val="0"/>
+              <w:pageBreakBefore w:val="0"/>
+              <w:widowControl w:val="0"/>
+              <w:pBdr>
+                <w:top w:space="0" w:sz="0" w:val="nil"/>
+                <w:left w:space="0" w:sz="0" w:val="nil"/>
+                <w:bottom w:space="0" w:sz="0" w:val="nil"/>
+                <w:right w:space="0" w:sz="0" w:val="nil"/>
+                <w:between w:space="0" w:sz="0" w:val="nil"/>
+              </w:pBdr>
+              <w:shd w:fill="auto" w:val="clear"/>
+              <w:spacing w:after="0" w:before="0" w:line="240" w:lineRule="auto"/>
+              <w:ind w:left="0" w:right="0" w:firstLine="0"/>
+              <w:jc w:val="left"/>
+              <w:rPr/>
+            </w:pPr>
+            <w:r>
+              <w:rPr>
+                <w:rtl w:val="0"/>
+              </w:rPr>
+              <w:t xml:space="preserve">Invalid login</w:t>
+            </w:r>
+          </w:p>
+        </w:tc>
+        <w:tc>
+          <w:tcPr>
+            <w:shd w:fill="auto" w:val="clear"/>
+            <w:tcMar>
+              <w:top w:w="100.0" w:type="dxa"/>
+              <w:left w:w="100.0" w:type="dxa"/>
+              <w:bottom w:w="100.0" w:type="dxa"/>
+              <w:right w:w="100.0" w:type="dxa"/>
+            </w:tcMar>
+            <w:vAlign w:val="top"/>
+          </w:tcPr>
+          <w:p>
+            <w:pPr>
+              <w:keepNext w:val="0"/>
+              <w:keepLines w:val="0"/>
+              <w:pageBreakBefore w:val="0"/>
+              <w:widowControl w:val="0"/>
+              <w:pBdr>
+                <w:top w:space="0" w:sz="0" w:val="nil"/>
+                <w:left w:space="0" w:sz="0" w:val="nil"/>
+                <w:bottom w:space="0" w:sz="0" w:val="nil"/>
+                <w:right w:space="0" w:sz="0" w:val="nil"/>
+                <w:between w:space="0" w:sz="0" w:val="nil"/>
+              </w:pBdr>
+              <w:shd w:fill="auto" w:val="clear"/>
+              <w:spacing w:after="0" w:before="0" w:line="240" w:lineRule="auto"/>
+              <w:ind w:left="0" w:right="0" w:firstLine="0"/>
+              <w:jc w:val="left"/>
+              <w:rPr/>
+            </w:pPr>
+            <w:r>
+              <w:rPr>
+                <w:rtl w:val="0"/>
+              </w:rPr>
+              <w:t xml:space="preserve">1.Enter Admin/admin12</w:t>
+            </w:r>
+          </w:p>
+        </w:tc>
+        <w:tc>
+          <w:tcPr>
+            <w:shd w:fill="auto" w:val="clear"/>
+            <w:tcMar>
+              <w:top w:w="100.0" w:type="dxa"/>
+              <w:left w:w="100.0" w:type="dxa"/>
+              <w:bottom w:w="100.0" w:type="dxa"/>
+              <w:right w:w="100.0" w:type="dxa"/>
+            </w:tcMar>
+            <w:vAlign w:val="top"/>
+          </w:tcPr>
+          <w:p>
+            <w:pPr>
+              <w:keepNext w:val="0"/>
+              <w:keepLines w:val="0"/>
+              <w:pageBreakBefore w:val="0"/>
+              <w:widowControl w:val="0"/>
+              <w:pBdr>
+                <w:top w:space="0" w:sz="0" w:val="nil"/>
+                <w:left w:space="0" w:sz="0" w:val="nil"/>
+                <w:bottom w:space="0" w:sz="0" w:val="nil"/>
+                <w:right w:space="0" w:sz="0" w:val="nil"/>
+                <w:between w:space="0" w:sz="0" w:val="nil"/>
+              </w:pBdr>
+              <w:shd w:fill="auto" w:val="clear"/>
+              <w:spacing w:after="0" w:before="0" w:line="240" w:lineRule="auto"/>
+              <w:ind w:left="0" w:right="0" w:firstLine="0"/>
+              <w:jc w:val="left"/>
+              <w:rPr/>
+            </w:pPr>
+            <w:r>
+              <w:rPr>
+                <w:rtl w:val="0"/>
+              </w:rPr>
+              <w:t xml:space="preserve">Error “Invalid password”</w:t>
+            </w:r>
+          </w:p>
+        </w:tc>
+        <w:tc>
+          <w:tcPr>
+            <w:shd w:fill="auto" w:val="clear"/>
+            <w:tcMar>
+              <w:top w:w="100.0" w:type="dxa"/>
+              <w:left w:w="100.0" w:type="dxa"/>
+              <w:bottom w:w="100.0" w:type="dxa"/>
+              <w:right w:w="100.0" w:type="dxa"/>
+            </w:tcMar>
+            <w:vAlign w:val="top"/>
+          </w:tcPr>
+          <w:p>
+            <w:pPr>
+              <w:widowControl w:val="0"/>
+              <w:spacing w:line="240" w:lineRule="auto"/>
+              <w:rPr/>
+            </w:pPr>
+            <w:r>
+              <w:rPr>
+                <w:rtl w:val="0"/>
+              </w:rPr>
+              <w:t xml:space="preserve">Error “Invalid password”</w:t>
+            </w:r>
+          </w:p>
+        </w:tc>
+      </w:tr>
+      <w:tr>
+        <w:trPr>
+          <w:cantSplit w:val="0"/>
+          <w:tblHeader w:val="0"/>
+        </w:trPr>
+        <w:tc>
+          <w:tcPr>
+            <w:shd w:fill="auto" w:val="clear"/>
+            <w:tcMar>
+              <w:top w:w="100.0" w:type="dxa"/>
+              <w:left w:w="100.0" w:type="dxa"/>
+              <w:bottom w:w="100.0" w:type="dxa"/>
+              <w:right w:w="100.0" w:type="dxa"/>
+            </w:tcMar>
+            <w:vAlign w:val="top"/>
+          </w:tcPr>
+          <w:p>
+            <w:pPr>
+              <w:keepNext w:val="0"/>
+              <w:keepLines w:val="0"/>
+              <w:pageBreakBefore w:val="0"/>
+              <w:widowControl w:val="0"/>
+              <w:pBdr>
+                <w:top w:space="0" w:sz="0" w:val="nil"/>
+                <w:left w:space="0" w:sz="0" w:val="nil"/>
+                <w:bottom w:space="0" w:sz="0" w:val="nil"/>
+                <w:right w:space="0" w:sz="0" w:val="nil"/>
+                <w:between w:space="0" w:sz="0" w:val="nil"/>
+              </w:pBdr>
+              <w:shd w:fill="auto" w:val="clear"/>
+              <w:spacing w:after="0" w:before="0" w:line="240" w:lineRule="auto"/>
+              <w:ind w:left="0" w:right="0" w:firstLine="0"/>
+              <w:jc w:val="left"/>
+              <w:rPr/>
+            </w:pPr>
+            <w:r>
+              <w:rPr>
+                <w:rtl w:val="0"/>
+              </w:rPr>
+              <w:t xml:space="preserve">TC3</w:t>
+            </w:r>
+          </w:p>
+        </w:tc>
+        <w:tc>
+          <w:tcPr>
+            <w:shd w:fill="auto" w:val="clear"/>
+            <w:tcMar>
+              <w:top w:w="100.0" w:type="dxa"/>
+              <w:left w:w="100.0" w:type="dxa"/>
+              <w:bottom w:w="100.0" w:type="dxa"/>
+              <w:right w:w="100.0" w:type="dxa"/>
+            </w:tcMar>
+            <w:vAlign w:val="top"/>
+          </w:tcPr>
+          <w:p>
+            <w:pPr>
+              <w:keepNext w:val="0"/>
+              <w:keepLines w:val="0"/>
+              <w:pageBreakBefore w:val="0"/>
+              <w:widowControl w:val="0"/>
+              <w:pBdr>
+                <w:top w:space="0" w:sz="0" w:val="nil"/>
+                <w:left w:space="0" w:sz="0" w:val="nil"/>
+                <w:bottom w:space="0" w:sz="0" w:val="nil"/>
+                <w:right w:space="0" w:sz="0" w:val="nil"/>
+                <w:between w:space="0" w:sz="0" w:val="nil"/>
+              </w:pBdr>
+              <w:shd w:fill="auto" w:val="clear"/>
+              <w:spacing w:after="0" w:before="0" w:line="240" w:lineRule="auto"/>
+              <w:ind w:left="0" w:right="0" w:firstLine="0"/>
+              <w:jc w:val="left"/>
+              <w:rPr/>
+            </w:pPr>
+            <w:r>
+              <w:rPr>
+                <w:rtl w:val="0"/>
+              </w:rPr>
+              <w:t xml:space="preserve">Admin</w:t>
+            </w:r>
+          </w:p>
+        </w:tc>
+        <w:tc>
+          <w:tcPr>
+            <w:shd w:fill="auto" w:val="clear"/>
+            <w:tcMar>
+              <w:top w:w="100.0" w:type="dxa"/>
+              <w:left w:w="100.0" w:type="dxa"/>
+              <w:bottom w:w="100.0" w:type="dxa"/>
+              <w:right w:w="100.0" w:type="dxa"/>
+            </w:tcMar>
+            <w:vAlign w:val="top"/>
+          </w:tcPr>
+          <w:p>
+            <w:pPr>
+              <w:keepNext w:val="0"/>
+              <w:keepLines w:val="0"/>
+              <w:pageBreakBefore w:val="0"/>
+              <w:widowControl w:val="0"/>
+              <w:pBdr>
+                <w:top w:space="0" w:sz="0" w:val="nil"/>
+                <w:left w:space="0" w:sz="0" w:val="nil"/>
+                <w:bottom w:space="0" w:sz="0" w:val="nil"/>
+                <w:right w:space="0" w:sz="0" w:val="nil"/>
+                <w:between w:space="0" w:sz="0" w:val="nil"/>
+              </w:pBdr>
+              <w:shd w:fill="auto" w:val="clear"/>
+              <w:spacing w:after="0" w:before="0" w:line="240" w:lineRule="auto"/>
+              <w:ind w:left="0" w:right="0" w:firstLine="0"/>
+              <w:jc w:val="left"/>
+              <w:rPr/>
+            </w:pPr>
+            <w:r>
+              <w:rPr>
+                <w:rtl w:val="0"/>
+              </w:rPr>
+              <w:t xml:space="preserve">Add user</w:t>
+            </w:r>
+          </w:p>
+        </w:tc>
+        <w:tc>
+          <w:tcPr>
+            <w:shd w:fill="auto" w:val="clear"/>
+            <w:tcMar>
+              <w:top w:w="100.0" w:type="dxa"/>
+              <w:left w:w="100.0" w:type="dxa"/>
+              <w:bottom w:w="100.0" w:type="dxa"/>
+              <w:right w:w="100.0" w:type="dxa"/>
+            </w:tcMar>
+            <w:vAlign w:val="top"/>
+          </w:tcPr>
+          <w:p>
+            <w:pPr>
+              <w:keepNext w:val="0"/>
+              <w:keepLines w:val="0"/>
+              <w:pageBreakBefore w:val="0"/>
+              <w:widowControl w:val="0"/>
+              <w:pBdr>
+                <w:top w:space="0" w:sz="0" w:val="nil"/>
+                <w:left w:space="0" w:sz="0" w:val="nil"/>
+                <w:bottom w:space="0" w:sz="0" w:val="nil"/>
+                <w:right w:space="0" w:sz="0" w:val="nil"/>
+                <w:between w:space="0" w:sz="0" w:val="nil"/>
+              </w:pBdr>
+              <w:shd w:fill="auto" w:val="clear"/>
+              <w:spacing w:after="0" w:before="0" w:line="240" w:lineRule="auto"/>
+              <w:ind w:left="0" w:right="0" w:firstLine="0"/>
+              <w:jc w:val="left"/>
+              <w:rPr/>
+            </w:pPr>
+            <w:hyperlink r:id="rId6">
+              <w:r>
+                <w:rPr>
+                  <w:color w:val="1155cc"/>
+                  <w:u w:val="single"/>
+                  <w:rtl w:val="0"/>
+                </w:rPr>
+                <w:t xml:space="preserve">1.Go</w:t>
+              </w:r>
+            </w:hyperlink>
+            <w:r>
+              <w:rPr>
+                <w:rtl w:val="0"/>
+              </w:rPr>
+              <w:t xml:space="preserve"> to Admin panel</w:t>
+              <w:br w:type="textWrapping"/>
+              <w:t xml:space="preserve">2.click “Add User”|</w:t>
+            </w:r>
+          </w:p>
+        </w:tc>
+        <w:tc>
+          <w:tcPr>
+            <w:shd w:fill="auto" w:val="clear"/>
+            <w:tcMar>
+              <w:top w:w="100.0" w:type="dxa"/>
+              <w:left w:w="100.0" w:type="dxa"/>
+              <w:bottom w:w="100.0" w:type="dxa"/>
+              <w:right w:w="100.0" w:type="dxa"/>
+            </w:tcMar>
+            <w:vAlign w:val="top"/>
+          </w:tcPr>
+          <w:p>
+            <w:pPr>
+              <w:keepNext w:val="0"/>
+              <w:keepLines w:val="0"/>
+              <w:pageBreakBefore w:val="0"/>
+              <w:widowControl w:val="0"/>
+              <w:pBdr>
+                <w:top w:space="0" w:sz="0" w:val="nil"/>
+                <w:left w:space="0" w:sz="0" w:val="nil"/>
+                <w:bottom w:space="0" w:sz="0" w:val="nil"/>
+                <w:right w:space="0" w:sz="0" w:val="nil"/>
+                <w:between w:space="0" w:sz="0" w:val="nil"/>
+              </w:pBdr>
+              <w:shd w:fill="auto" w:val="clear"/>
+              <w:spacing w:after="0" w:before="0" w:line="240" w:lineRule="auto"/>
+              <w:ind w:left="0" w:right="0" w:firstLine="0"/>
+              <w:jc w:val="left"/>
+              <w:rPr/>
+            </w:pPr>
+            <w:r>
+              <w:rPr>
+                <w:rtl w:val="0"/>
+              </w:rPr>
+              <w:t xml:space="preserve">User added successfully</w:t>
+            </w:r>
+          </w:p>
+        </w:tc>
+        <w:tc>
+          <w:tcPr>
+            <w:shd w:fill="auto" w:val="clear"/>
+            <w:tcMar>
+              <w:top w:w="100.0" w:type="dxa"/>
+              <w:left w:w="100.0" w:type="dxa"/>
+              <w:bottom w:w="100.0" w:type="dxa"/>
+              <w:right w:w="100.0" w:type="dxa"/>
+            </w:tcMar>
+            <w:vAlign w:val="top"/>
+          </w:tcPr>
+          <w:p>
+            <w:pPr>
+              <w:widowControl w:val="0"/>
+              <w:spacing w:line="240" w:lineRule="auto"/>
+              <w:rPr/>
+            </w:pPr>
+            <w:r>
+              <w:rPr>
+                <w:rtl w:val="0"/>
+              </w:rPr>
+              <w:t xml:space="preserve">User added successfully</w:t>
+            </w:r>
+          </w:p>
+        </w:tc>
+      </w:tr>
+      <w:tr>
+        <w:trPr>
+          <w:cantSplit w:val="0"/>
+          <w:tblHeader w:val="0"/>
+        </w:trPr>
+        <w:tc>
+          <w:tcPr>
+            <w:shd w:fill="auto" w:val="clear"/>
+            <w:tcMar>
+              <w:top w:w="100.0" w:type="dxa"/>
+              <w:left w:w="100.0" w:type="dxa"/>
+              <w:bottom w:w="100.0" w:type="dxa"/>
+              <w:right w:w="100.0" w:type="dxa"/>
+            </w:tcMar>
+            <w:vAlign w:val="top"/>
+          </w:tcPr>
+          <w:p>
+            <w:pPr>
+              <w:keepNext w:val="0"/>
+              <w:keepLines w:val="0"/>
+              <w:pageBreakBefore w:val="0"/>
+              <w:widowControl w:val="0"/>
+              <w:pBdr>
+                <w:top w:space="0" w:sz="0" w:val="nil"/>
+                <w:left w:space="0" w:sz="0" w:val="nil"/>
+                <w:bottom w:space="0" w:sz="0" w:val="nil"/>
+                <w:right w:space="0" w:sz="0" w:val="nil"/>
+                <w:between w:space="0" w:sz="0" w:val="nil"/>
+              </w:pBdr>
+              <w:shd w:fill="auto" w:val="clear"/>
+              <w:spacing w:after="0" w:before="0" w:line="240" w:lineRule="auto"/>
+              <w:ind w:left="0" w:right="0" w:firstLine="0"/>
+              <w:jc w:val="left"/>
+              <w:rPr/>
+            </w:pPr>
+            <w:r>
+              <w:rPr>
+                <w:rtl w:val="0"/>
+              </w:rPr>
+              <w:t xml:space="preserve">TC4</w:t>
+            </w:r>
+          </w:p>
+        </w:tc>
+        <w:tc>
+          <w:tcPr>
+            <w:shd w:fill="auto" w:val="clear"/>
+            <w:tcMar>
+              <w:top w:w="100.0" w:type="dxa"/>
+              <w:left w:w="100.0" w:type="dxa"/>
+              <w:bottom w:w="100.0" w:type="dxa"/>
+              <w:right w:w="100.0" w:type="dxa"/>
+            </w:tcMar>
+            <w:vAlign w:val="top"/>
+          </w:tcPr>
+          <w:p>
+            <w:pPr>
+              <w:keepNext w:val="0"/>
+              <w:keepLines w:val="0"/>
+              <w:pageBreakBefore w:val="0"/>
+              <w:widowControl w:val="0"/>
+              <w:pBdr>
+                <w:top w:space="0" w:sz="0" w:val="nil"/>
+                <w:left w:space="0" w:sz="0" w:val="nil"/>
+                <w:bottom w:space="0" w:sz="0" w:val="nil"/>
+                <w:right w:space="0" w:sz="0" w:val="nil"/>
+                <w:between w:space="0" w:sz="0" w:val="nil"/>
+              </w:pBdr>
+              <w:shd w:fill="auto" w:val="clear"/>
+              <w:spacing w:after="0" w:before="0" w:line="240" w:lineRule="auto"/>
+              <w:ind w:left="0" w:right="0" w:firstLine="0"/>
+              <w:jc w:val="left"/>
+              <w:rPr/>
+            </w:pPr>
+            <w:r>
+              <w:rPr>
+                <w:rtl w:val="0"/>
+              </w:rPr>
+              <w:t xml:space="preserve">Leave</w:t>
+            </w:r>
+          </w:p>
+        </w:tc>
+        <w:tc>
+          <w:tcPr>
+            <w:shd w:fill="auto" w:val="clear"/>
+            <w:tcMar>
+              <w:top w:w="100.0" w:type="dxa"/>
+              <w:left w:w="100.0" w:type="dxa"/>
+              <w:bottom w:w="100.0" w:type="dxa"/>
+              <w:right w:w="100.0" w:type="dxa"/>
+            </w:tcMar>
+            <w:vAlign w:val="top"/>
+          </w:tcPr>
+          <w:p>
+            <w:pPr>
+              <w:keepNext w:val="0"/>
+              <w:keepLines w:val="0"/>
+              <w:pageBreakBefore w:val="0"/>
+              <w:widowControl w:val="0"/>
+              <w:pBdr>
+                <w:top w:space="0" w:sz="0" w:val="nil"/>
+                <w:left w:space="0" w:sz="0" w:val="nil"/>
+                <w:bottom w:space="0" w:sz="0" w:val="nil"/>
+                <w:right w:space="0" w:sz="0" w:val="nil"/>
+                <w:between w:space="0" w:sz="0" w:val="nil"/>
+              </w:pBdr>
+              <w:shd w:fill="auto" w:val="clear"/>
+              <w:spacing w:after="0" w:before="0" w:line="240" w:lineRule="auto"/>
+              <w:ind w:left="0" w:right="0" w:firstLine="0"/>
+              <w:jc w:val="left"/>
+              <w:rPr/>
+            </w:pPr>
+            <w:r>
+              <w:rPr>
+                <w:rtl w:val="0"/>
+              </w:rPr>
+              <w:t xml:space="preserve">Apply for leave</w:t>
+            </w:r>
+          </w:p>
+        </w:tc>
+        <w:tc>
+          <w:tcPr>
+            <w:shd w:fill="auto" w:val="clear"/>
+            <w:tcMar>
+              <w:top w:w="100.0" w:type="dxa"/>
+              <w:left w:w="100.0" w:type="dxa"/>
+              <w:bottom w:w="100.0" w:type="dxa"/>
+              <w:right w:w="100.0" w:type="dxa"/>
+            </w:tcMar>
+            <w:vAlign w:val="top"/>
+          </w:tcPr>
+          <w:p>
+            <w:pPr>
+              <w:keepNext w:val="0"/>
+              <w:keepLines w:val="0"/>
+              <w:pageBreakBefore w:val="0"/>
+              <w:widowControl w:val="0"/>
+              <w:pBdr>
+                <w:top w:space="0" w:sz="0" w:val="nil"/>
+                <w:left w:space="0" w:sz="0" w:val="nil"/>
+                <w:bottom w:space="0" w:sz="0" w:val="nil"/>
+                <w:right w:space="0" w:sz="0" w:val="nil"/>
+                <w:between w:space="0" w:sz="0" w:val="nil"/>
+              </w:pBdr>
+              <w:shd w:fill="auto" w:val="clear"/>
+              <w:spacing w:after="0" w:before="0" w:line="240" w:lineRule="auto"/>
+              <w:ind w:left="0" w:right="0" w:firstLine="0"/>
+              <w:jc w:val="left"/>
+              <w:rPr/>
+            </w:pPr>
+            <w:hyperlink r:id="rId7">
+              <w:r>
+                <w:rPr>
+                  <w:color w:val="1155cc"/>
+                  <w:u w:val="single"/>
+                  <w:rtl w:val="0"/>
+                </w:rPr>
+                <w:t xml:space="preserve">1.Go</w:t>
+              </w:r>
+            </w:hyperlink>
+            <w:r>
+              <w:rPr>
+                <w:rtl w:val="0"/>
+              </w:rPr>
+              <w:t xml:space="preserve"> to Leave panel </w:t>
+            </w:r>
+          </w:p>
+          <w:p>
+            <w:pPr>
+              <w:keepNext w:val="0"/>
+              <w:keepLines w:val="0"/>
+              <w:pageBreakBefore w:val="0"/>
+              <w:widowControl w:val="0"/>
+              <w:pBdr>
+                <w:top w:space="0" w:sz="0" w:val="nil"/>
+                <w:left w:space="0" w:sz="0" w:val="nil"/>
+                <w:bottom w:space="0" w:sz="0" w:val="nil"/>
+                <w:right w:space="0" w:sz="0" w:val="nil"/>
+                <w:between w:space="0" w:sz="0" w:val="nil"/>
+              </w:pBdr>
+              <w:shd w:fill="auto" w:val="clear"/>
+              <w:spacing w:after="0" w:before="0" w:line="240" w:lineRule="auto"/>
+              <w:ind w:left="0" w:right="0" w:firstLine="0"/>
+              <w:jc w:val="left"/>
+              <w:rPr/>
+            </w:pPr>
+            <w:r>
+              <w:rPr>
+                <w:rtl w:val="0"/>
+              </w:rPr>
+              <w:t xml:space="preserve">2.click “Apply”</w:t>
+            </w:r>
+          </w:p>
+        </w:tc>
+        <w:tc>
+          <w:tcPr>
+            <w:shd w:fill="auto" w:val="clear"/>
+            <w:tcMar>
+              <w:top w:w="100.0" w:type="dxa"/>
+              <w:left w:w="100.0" w:type="dxa"/>
+              <w:bottom w:w="100.0" w:type="dxa"/>
+              <w:right w:w="100.0" w:type="dxa"/>
+            </w:tcMar>
+            <w:vAlign w:val="top"/>
+          </w:tcPr>
+          <w:p>
+            <w:pPr>
+              <w:keepNext w:val="0"/>
+              <w:keepLines w:val="0"/>
+              <w:pageBreakBefore w:val="0"/>
+              <w:widowControl w:val="0"/>
+              <w:pBdr>
+                <w:top w:space="0" w:sz="0" w:val="nil"/>
+                <w:left w:space="0" w:sz="0" w:val="nil"/>
+                <w:bottom w:space="0" w:sz="0" w:val="nil"/>
+                <w:right w:space="0" w:sz="0" w:val="nil"/>
+                <w:between w:space="0" w:sz="0" w:val="nil"/>
+              </w:pBdr>
+              <w:shd w:fill="auto" w:val="clear"/>
+              <w:spacing w:after="0" w:before="0" w:line="240" w:lineRule="auto"/>
+              <w:ind w:left="0" w:right="0" w:firstLine="0"/>
+              <w:jc w:val="left"/>
+              <w:rPr/>
+            </w:pPr>
+            <w:r>
+              <w:rPr>
+                <w:rtl w:val="0"/>
+              </w:rPr>
+              <w:t xml:space="preserve">Application proceed </w:t>
+            </w:r>
+          </w:p>
+        </w:tc>
+        <w:tc>
+          <w:tcPr>
+            <w:shd w:fill="auto" w:val="clear"/>
+            <w:tcMar>
+              <w:top w:w="100.0" w:type="dxa"/>
+              <w:left w:w="100.0" w:type="dxa"/>
+              <w:bottom w:w="100.0" w:type="dxa"/>
+              <w:right w:w="100.0" w:type="dxa"/>
+            </w:tcMar>
+            <w:vAlign w:val="top"/>
+          </w:tcPr>
+          <w:p>
+            <w:pPr>
+              <w:keepNext w:val="0"/>
+              <w:keepLines w:val="0"/>
+              <w:pageBreakBefore w:val="0"/>
+              <w:widowControl w:val="0"/>
+              <w:pBdr>
+                <w:top w:space="0" w:sz="0" w:val="nil"/>
+                <w:left w:space="0" w:sz="0" w:val="nil"/>
+                <w:bottom w:space="0" w:sz="0" w:val="nil"/>
+                <w:right w:space="0" w:sz="0" w:val="nil"/>
+                <w:between w:space="0" w:sz="0" w:val="nil"/>
+              </w:pBdr>
+              <w:shd w:fill="auto" w:val="clear"/>
+              <w:spacing w:after="0" w:before="0" w:line="240" w:lineRule="auto"/>
+              <w:ind w:left="0" w:right="0" w:firstLine="0"/>
+              <w:jc w:val="left"/>
+              <w:rPr/>
+            </w:pPr>
+            <w:r>
+              <w:rPr>
+                <w:rtl w:val="0"/>
+              </w:rPr>
+              <w:t xml:space="preserve">No Leave Type exists</w:t>
+            </w:r>
+          </w:p>
+        </w:tc>
+      </w:tr>
+      <w:tr>
+        <w:trPr>
+          <w:cantSplit w:val="0"/>
+          <w:tblHeader w:val="0"/>
+        </w:trPr>
+        <w:tc>
+          <w:tcPr>
+            <w:shd w:fill="auto" w:val="clear"/>
+            <w:tcMar>
+              <w:top w:w="100.0" w:type="dxa"/>
+              <w:left w:w="100.0" w:type="dxa"/>
+              <w:bottom w:w="100.0" w:type="dxa"/>
+              <w:right w:w="100.0" w:type="dxa"/>
+            </w:tcMar>
+            <w:vAlign w:val="top"/>
+          </w:tcPr>
+          <w:p>
+            <w:pPr>
+              <w:keepNext w:val="0"/>
+              <w:keepLines w:val="0"/>
+              <w:pageBreakBefore w:val="0"/>
+              <w:widowControl w:val="0"/>
+              <w:pBdr>
+                <w:top w:space="0" w:sz="0" w:val="nil"/>
+                <w:left w:space="0" w:sz="0" w:val="nil"/>
+                <w:bottom w:space="0" w:sz="0" w:val="nil"/>
+                <w:right w:space="0" w:sz="0" w:val="nil"/>
+                <w:between w:space="0" w:sz="0" w:val="nil"/>
+              </w:pBdr>
+              <w:shd w:fill="auto" w:val="clear"/>
+              <w:spacing w:after="0" w:before="0" w:line="240" w:lineRule="auto"/>
+              <w:ind w:left="0" w:right="0" w:firstLine="0"/>
+              <w:jc w:val="left"/>
+              <w:rPr/>
+            </w:pPr>
+            <w:r>
+              <w:rPr>
+                <w:rtl w:val="0"/>
+              </w:rPr>
+              <w:t xml:space="preserve">TC5</w:t>
+            </w:r>
+          </w:p>
+        </w:tc>
+        <w:tc>
+          <w:tcPr>
+            <w:shd w:fill="auto" w:val="clear"/>
+            <w:tcMar>
+              <w:top w:w="100.0" w:type="dxa"/>
+              <w:left w:w="100.0" w:type="dxa"/>
+              <w:bottom w:w="100.0" w:type="dxa"/>
+              <w:right w:w="100.0" w:type="dxa"/>
+            </w:tcMar>
+            <w:vAlign w:val="top"/>
+          </w:tcPr>
+          <w:p>
+            <w:pPr>
+              <w:keepNext w:val="0"/>
+              <w:keepLines w:val="0"/>
+              <w:pageBreakBefore w:val="0"/>
+              <w:widowControl w:val="0"/>
+              <w:pBdr>
+                <w:top w:space="0" w:sz="0" w:val="nil"/>
+                <w:left w:space="0" w:sz="0" w:val="nil"/>
+                <w:bottom w:space="0" w:sz="0" w:val="nil"/>
+                <w:right w:space="0" w:sz="0" w:val="nil"/>
+                <w:between w:space="0" w:sz="0" w:val="nil"/>
+              </w:pBdr>
+              <w:shd w:fill="auto" w:val="clear"/>
+              <w:spacing w:after="0" w:before="0" w:line="240" w:lineRule="auto"/>
+              <w:ind w:left="0" w:right="0" w:firstLine="0"/>
+              <w:jc w:val="left"/>
+              <w:rPr/>
+            </w:pPr>
+            <w:r>
+              <w:rPr>
+                <w:rtl w:val="0"/>
+              </w:rPr>
+              <w:t xml:space="preserve">PIM</w:t>
+            </w:r>
+          </w:p>
+        </w:tc>
+        <w:tc>
+          <w:tcPr>
+            <w:shd w:fill="auto" w:val="clear"/>
+            <w:tcMar>
+              <w:top w:w="100.0" w:type="dxa"/>
+              <w:left w:w="100.0" w:type="dxa"/>
+              <w:bottom w:w="100.0" w:type="dxa"/>
+              <w:right w:w="100.0" w:type="dxa"/>
+            </w:tcMar>
+            <w:vAlign w:val="top"/>
+          </w:tcPr>
+          <w:p>
+            <w:pPr>
+              <w:keepNext w:val="0"/>
+              <w:keepLines w:val="0"/>
+              <w:pageBreakBefore w:val="0"/>
+              <w:widowControl w:val="0"/>
+              <w:pBdr>
+                <w:top w:space="0" w:sz="0" w:val="nil"/>
+                <w:left w:space="0" w:sz="0" w:val="nil"/>
+                <w:bottom w:space="0" w:sz="0" w:val="nil"/>
+                <w:right w:space="0" w:sz="0" w:val="nil"/>
+                <w:between w:space="0" w:sz="0" w:val="nil"/>
+              </w:pBdr>
+              <w:shd w:fill="auto" w:val="clear"/>
+              <w:spacing w:after="0" w:before="0" w:line="240" w:lineRule="auto"/>
+              <w:ind w:left="0" w:right="0" w:firstLine="0"/>
+              <w:jc w:val="left"/>
+              <w:rPr/>
+            </w:pPr>
+            <w:r>
+              <w:rPr>
+                <w:rtl w:val="0"/>
+              </w:rPr>
+              <w:t xml:space="preserve">Add new employee</w:t>
+            </w:r>
+          </w:p>
+        </w:tc>
+        <w:tc>
+          <w:tcPr>
+            <w:shd w:fill="auto" w:val="clear"/>
+            <w:tcMar>
+              <w:top w:w="100.0" w:type="dxa"/>
+              <w:left w:w="100.0" w:type="dxa"/>
+              <w:bottom w:w="100.0" w:type="dxa"/>
+              <w:right w:w="100.0" w:type="dxa"/>
+            </w:tcMar>
+            <w:vAlign w:val="top"/>
+          </w:tcPr>
+          <w:p>
+            <w:pPr>
+              <w:keepNext w:val="0"/>
+              <w:keepLines w:val="0"/>
+              <w:pageBreakBefore w:val="0"/>
+              <w:widowControl w:val="0"/>
+              <w:pBdr>
+                <w:top w:space="0" w:sz="0" w:val="nil"/>
+                <w:left w:space="0" w:sz="0" w:val="nil"/>
+                <w:bottom w:space="0" w:sz="0" w:val="nil"/>
+                <w:right w:space="0" w:sz="0" w:val="nil"/>
+                <w:between w:space="0" w:sz="0" w:val="nil"/>
+              </w:pBdr>
+              <w:shd w:fill="auto" w:val="clear"/>
+              <w:spacing w:after="0" w:before="0" w:line="240" w:lineRule="auto"/>
+              <w:ind w:left="0" w:right="0" w:firstLine="0"/>
+              <w:jc w:val="left"/>
+              <w:rPr/>
+            </w:pPr>
+            <w:hyperlink r:id="rId8">
+              <w:r>
+                <w:rPr>
+                  <w:color w:val="1155cc"/>
+                  <w:u w:val="single"/>
+                  <w:rtl w:val="0"/>
+                </w:rPr>
+                <w:t xml:space="preserve">1.Go</w:t>
+              </w:r>
+            </w:hyperlink>
+            <w:r>
+              <w:rPr>
+                <w:rtl w:val="0"/>
+              </w:rPr>
+              <w:t xml:space="preserve"> to PIM panel </w:t>
+            </w:r>
+          </w:p>
+          <w:p>
+            <w:pPr>
+              <w:keepNext w:val="0"/>
+              <w:keepLines w:val="0"/>
+              <w:pageBreakBefore w:val="0"/>
+              <w:widowControl w:val="0"/>
+              <w:pBdr>
+                <w:top w:space="0" w:sz="0" w:val="nil"/>
+                <w:left w:space="0" w:sz="0" w:val="nil"/>
+                <w:bottom w:space="0" w:sz="0" w:val="nil"/>
+                <w:right w:space="0" w:sz="0" w:val="nil"/>
+                <w:between w:space="0" w:sz="0" w:val="nil"/>
+              </w:pBdr>
+              <w:shd w:fill="auto" w:val="clear"/>
+              <w:spacing w:after="0" w:before="0" w:line="240" w:lineRule="auto"/>
+              <w:ind w:left="0" w:right="0" w:firstLine="0"/>
+              <w:jc w:val="left"/>
+              <w:rPr/>
+            </w:pPr>
+            <w:r>
+              <w:rPr>
+                <w:rtl w:val="0"/>
+              </w:rPr>
+              <w:t xml:space="preserve">2.click “Add” </w:t>
+            </w:r>
+          </w:p>
+        </w:tc>
+        <w:tc>
+          <w:tcPr>
+            <w:shd w:fill="auto" w:val="clear"/>
+            <w:tcMar>
+              <w:top w:w="100.0" w:type="dxa"/>
+              <w:left w:w="100.0" w:type="dxa"/>
+              <w:bottom w:w="100.0" w:type="dxa"/>
+              <w:right w:w="100.0" w:type="dxa"/>
+            </w:tcMar>
+            <w:vAlign w:val="top"/>
+          </w:tcPr>
+          <w:p>
+            <w:pPr>
+              <w:keepNext w:val="0"/>
+              <w:keepLines w:val="0"/>
+              <w:pageBreakBefore w:val="0"/>
+              <w:widowControl w:val="0"/>
+              <w:pBdr>
+                <w:top w:space="0" w:sz="0" w:val="nil"/>
+                <w:left w:space="0" w:sz="0" w:val="nil"/>
+                <w:bottom w:space="0" w:sz="0" w:val="nil"/>
+                <w:right w:space="0" w:sz="0" w:val="nil"/>
+                <w:between w:space="0" w:sz="0" w:val="nil"/>
+              </w:pBdr>
+              <w:shd w:fill="auto" w:val="clear"/>
+              <w:spacing w:after="0" w:before="0" w:line="240" w:lineRule="auto"/>
+              <w:ind w:left="0" w:right="0" w:firstLine="0"/>
+              <w:jc w:val="left"/>
+              <w:rPr/>
+            </w:pPr>
+            <w:r>
+              <w:rPr>
+                <w:rtl w:val="0"/>
+              </w:rPr>
+              <w:t xml:space="preserve">User added successfully</w:t>
+            </w:r>
+          </w:p>
+        </w:tc>
+        <w:tc>
+          <w:tcPr>
+            <w:shd w:fill="auto" w:val="clear"/>
+            <w:tcMar>
+              <w:top w:w="100.0" w:type="dxa"/>
+              <w:left w:w="100.0" w:type="dxa"/>
+              <w:bottom w:w="100.0" w:type="dxa"/>
+              <w:right w:w="100.0" w:type="dxa"/>
+            </w:tcMar>
+            <w:vAlign w:val="top"/>
+          </w:tcPr>
+          <w:p>
+            <w:pPr>
+              <w:widowControl w:val="0"/>
+              <w:spacing w:line="240" w:lineRule="auto"/>
+              <w:rPr/>
+            </w:pPr>
+            <w:r>
+              <w:rPr>
+                <w:rtl w:val="0"/>
+              </w:rPr>
+              <w:t xml:space="preserve">User added successfully</w:t>
+            </w:r>
+          </w:p>
+        </w:tc>
+      </w:tr>
+    </w:tbl>
+    <w:p>
+      <w:pPr>
+        <w:rPr/>
+      </w:pPr>
+      <w:r>
+        <w:rPr>
+          <w:rtl w:val="0"/>
+        </w:rPr>
+      </w:r>
+    </w:p>
+    <w:p>
+      <w:pPr>
+        <w:rPr>
+          <w:b w:val="1"/>
+          <w:color w:val="1155cc"/>
+          <w:u w:val="single"/>
+        </w:rPr>
+      </w:pPr>
+      <w:r>
+        <w:rPr>
+          <w:b w:val="1"/>
+          <w:color w:val="1155cc"/>
+          <w:u w:val="single"/>
+          <w:rtl w:val="0"/>
+        </w:rPr>
+        <w:t xml:space="preserve">Demo videos are attached </w:t>
+      </w:r>
+    </w:p>
+    <w:p>
+      <w:pPr>
+        <w:rPr>
+          <w:b w:val="1"/>
+        </w:rPr>
+      </w:pPr>
+      <w:r>
+        <w:rPr>
+          <w:rtl w:val="0"/>
+        </w:rPr>
+      </w:r>
+    </w:p>
+    <w:p>
+      <w:pPr>
+        <w:rPr>
+          <w:b w:val="1"/>
+        </w:rPr>
+      </w:pPr>
+      <w:r>
+        <w:rPr>
+          <w:rtl w:val="0"/>
+        </w:rPr>
+      </w:r>
+    </w:p>
+    <w:p>
+      <w:pPr>
+        <w:rPr>
+          <w:b w:val="1"/>
+        </w:rPr>
+      </w:pPr>
+      <w:r>
+        <w:rPr>
+          <w:rtl w:val="0"/>
+        </w:rPr>
+      </w:r>
+    </w:p>
+    <w:p>
+      <w:pPr>
+        <w:rPr>
+          <w:b w:val="1"/>
+        </w:rPr>
+      </w:pPr>
+      <w:r>
+        <w:rPr>
+          <w:rtl w:val="0"/>
+        </w:rPr>
+      </w:r>
+    </w:p>
+    <w:p>
+      <w:pPr>
+        <w:rPr>
+          <w:b w:val="1"/>
+        </w:rPr>
+      </w:pPr>
+      <w:r>
+        <w:rPr>
+          <w:rtl w:val="0"/>
+        </w:rPr>
+      </w:r>
+    </w:p>
+    <w:p>
+      <w:pPr>
+        <w:rPr>
+          <w:b w:val="1"/>
+        </w:rPr>
+      </w:pPr>
+      <w:r>
+        <w:rPr>
+          <w:rtl w:val="0"/>
+        </w:rPr>
+      </w:r>
+    </w:p>
+    <w:p>
+      <w:pPr>
+        <w:rPr>
+          <w:b w:val="1"/>
+        </w:rPr>
+      </w:pPr>
+      <w:r>
+        <w:rPr>
+          <w:rtl w:val="0"/>
+        </w:rPr>
+      </w:r>
+    </w:p>
+    <w:p>
+      <w:pPr>
+        <w:rPr>
+          <w:b w:val="1"/>
+        </w:rPr>
+      </w:pPr>
+      <w:r>
+        <w:rPr>
+          <w:rtl w:val="0"/>
+        </w:rPr>
+      </w:r>
+    </w:p>
+    <w:p>
+      <w:pPr>
+        <w:rPr>
+          <w:b w:val="1"/>
+        </w:rPr>
+      </w:pPr>
+      <w:r>
+        <w:rPr>
+          <w:rtl w:val="0"/>
+        </w:rPr>
+      </w:r>
+    </w:p>
+    <w:p>
+      <w:pPr>
+        <w:rPr>
+          <w:b w:val="1"/>
+        </w:rPr>
+      </w:pPr>
+      <w:r>
+        <w:rPr>
+          <w:rtl w:val="0"/>
+        </w:rPr>
+      </w:r>
+    </w:p>
+    <w:p>
+      <w:pPr>
+        <w:rPr>
+          <w:b w:val="1"/>
+        </w:rPr>
+      </w:pPr>
+      <w:r>
+        <w:rPr>
+          <w:rtl w:val="0"/>
+        </w:rPr>
+      </w:r>
+    </w:p>
+    <w:p>
+      <w:pPr>
+        <w:rPr>
+          <w:b w:val="1"/>
+        </w:rPr>
+      </w:pPr>
+      <w:r>
+        <w:rPr>
+          <w:rtl w:val="0"/>
+        </w:rPr>
+      </w:r>
+    </w:p>
+    <w:p>
+      <w:pPr>
+        <w:rPr>
+          <w:b w:val="1"/>
+        </w:rPr>
+      </w:pPr>
+      <w:r>
+        <w:rPr>
+          <w:rtl w:val="0"/>
+        </w:rPr>
+      </w:r>
+    </w:p>
+    <w:p>
+      <w:pPr>
+        <w:pStyle w:val="Heading3"/>
+        <w:rPr>
+          <w:b w:val="1"/>
+          <w:color w:val="1155cc"/>
+        </w:rPr>
+      </w:pPr>
+      <w:bookmarkStart w:colFirst="0" w:colLast="0" w:name="_ywmmu5w5309c" w:id="7"/>
+      <w:bookmarkEnd w:id="7"/>
+      <w:r>
+        <w:rPr>
+          <w:b w:val="1"/>
+          <w:color w:val="1155cc"/>
+          <w:rtl w:val="0"/>
+        </w:rPr>
+        <w:t xml:space="preserve">Test Report</w:t>
+      </w:r>
+      <w:r>
+        <w:pict>
+          <v:rect style="width:0.0pt;height:1.5pt" o:hr="t" o:hrstd="t" o:hralign="center" fillcolor="#A0A0A0" stroked="f"/>
+        </w:pict>
+      </w:r>
+      <w:r>
+        <w:rPr>
+          <w:rtl w:val="0"/>
+        </w:rPr>
+      </w:r>
+    </w:p>
+    <w:p>
+      <w:pPr>
+        <w:rPr/>
+      </w:pPr>
+      <w:r>
+        <w:rPr>
+          <w:rtl w:val="0"/>
+        </w:rPr>
+      </w:r>
+    </w:p>
+    <w:p>
+      <w:pPr>
+        <w:rPr/>
+      </w:pPr>
+      <w:r>
+        <w:rPr>
+          <w:rtl w:val="0"/>
+        </w:rPr>
+        <w:t xml:space="preserve">Total Test cases : 5</w:t>
+      </w:r>
+    </w:p>
+    <w:p>
+      <w:pPr>
+        <w:rPr/>
+      </w:pPr>
+      <w:r>
+        <w:rPr>
+          <w:rtl w:val="0"/>
+        </w:rPr>
+        <w:t xml:space="preserve">Pass : 4</w:t>
+      </w:r>
+    </w:p>
+    <w:p>
+      <w:pPr>
+        <w:rPr/>
+      </w:pPr>
+      <w:r>
+        <w:rPr>
+          <w:rtl w:val="0"/>
+        </w:rPr>
+        <w:t xml:space="preserve">Fail : 1</w:t>
+      </w:r>
+    </w:p>
+    <w:p>
+      <w:pPr>
+        <w:rPr/>
+      </w:pPr>
+      <w:r>
+        <w:rPr>
+          <w:rtl w:val="0"/>
+        </w:rPr>
+      </w:r>
+    </w:p>
+    <w:p>
+      <w:pPr>
+        <w:rPr/>
+      </w:pPr>
+      <w:r>
+        <w:rPr>
+          <w:rtl w:val="0"/>
+        </w:rPr>
+      </w:r>
+    </w:p>
+    <w:p>
+      <w:pPr>
+        <w:rPr/>
+      </w:pPr>
+      <w:r>
+        <w:rPr>
+          <w:rtl w:val="0"/>
+        </w:rPr>
+      </w:r>
+    </w:p>
+    <w:tbl>
+      <w:tblPr>
+        <w:tblStyle w:val="Table3"/>
+        <w:tblW w:w="6906.847066651881" w:type="dxa"/>
+        <w:jc w:val="left"/>
+        <w:tblBorders>
+          <w:top w:color="000000" w:space="0" w:sz="8" w:val="single"/>
+          <w:left w:color="000000" w:space="0" w:sz="8" w:val="single"/>
+          <w:bottom w:color="000000" w:space="0" w:sz="8" w:val="single"/>
+          <w:right w:color="000000" w:space="0" w:sz="8" w:val="single"/>
+          <w:insideH w:color="000000" w:space="0" w:sz="8" w:val="single"/>
+          <w:insideV w:color="000000" w:space="0" w:sz="8" w:val="single"/>
+        </w:tblBorders>
+        <w:tblLayout w:type="fixed"/>
+        <w:tblLook w:val="0600"/>
+      </w:tblPr>
+      <w:tblGrid>
+        <w:gridCol w:w="805.0926028612622"/>
+        <w:gridCol w:w="1257.0744149939005"/>
+        <w:gridCol w:w="1511.3141843185097"/>
+        <w:gridCol w:w="1666.682932239104"/>
+        <w:gridCol w:w="1666.682932239104"/>
+        <w:tblGridChange w:id="0">
+          <w:tblGrid>
+            <w:gridCol w:w="805.0926028612622"/>
+            <w:gridCol w:w="1257.0744149939005"/>
+            <w:gridCol w:w="1511.3141843185097"/>
+            <w:gridCol w:w="1666.682932239104"/>
+            <w:gridCol w:w="1666.682932239104"/>
+          </w:tblGrid>
+        </w:tblGridChange>
+      </w:tblGrid>
+      <w:tr>
+        <w:trPr>
+          <w:cantSplit w:val="0"/>
+          <w:tblHeader w:val="0"/>
+        </w:trPr>
+        <w:tc>
+          <w:tcPr>
+            <w:shd w:fill="auto" w:val="clear"/>
+            <w:tcMar>
+              <w:top w:w="100.0" w:type="dxa"/>
+              <w:left w:w="100.0" w:type="dxa"/>
+              <w:bottom w:w="100.0" w:type="dxa"/>
+              <w:right w:w="100.0" w:type="dxa"/>
+            </w:tcMar>
+            <w:vAlign w:val="top"/>
+          </w:tcPr>
+          <w:p>
+            <w:pPr>
+              <w:widowControl w:val="0"/>
+              <w:spacing w:line="240" w:lineRule="auto"/>
+              <w:rPr/>
+            </w:pPr>
+            <w:r>
+              <w:rPr>
+                <w:rtl w:val="0"/>
+              </w:rPr>
+              <w:t xml:space="preserve">ID</w:t>
+            </w:r>
+          </w:p>
+        </w:tc>
+        <w:tc>
+          <w:tcPr>
+            <w:shd w:fill="auto" w:val="clear"/>
+            <w:tcMar>
+              <w:top w:w="100.0" w:type="dxa"/>
+              <w:left w:w="100.0" w:type="dxa"/>
+              <w:bottom w:w="100.0" w:type="dxa"/>
+              <w:right w:w="100.0" w:type="dxa"/>
+            </w:tcMar>
+            <w:vAlign w:val="top"/>
+          </w:tcPr>
+          <w:p>
+            <w:pPr>
+              <w:widowControl w:val="0"/>
+              <w:spacing w:line="240" w:lineRule="auto"/>
+              <w:rPr/>
+            </w:pPr>
+            <w:r>
+              <w:rPr>
+                <w:rtl w:val="0"/>
+              </w:rPr>
+              <w:t xml:space="preserve">Module</w:t>
+            </w:r>
+          </w:p>
+        </w:tc>
+        <w:tc>
+          <w:tcPr>
+            <w:shd w:fill="auto" w:val="clear"/>
+            <w:tcMar>
+              <w:top w:w="100.0" w:type="dxa"/>
+              <w:left w:w="100.0" w:type="dxa"/>
+              <w:bottom w:w="100.0" w:type="dxa"/>
+              <w:right w:w="100.0" w:type="dxa"/>
+            </w:tcMar>
+            <w:vAlign w:val="top"/>
+          </w:tcPr>
+          <w:p>
+            <w:pPr>
+              <w:widowControl w:val="0"/>
+              <w:spacing w:line="240" w:lineRule="auto"/>
+              <w:rPr/>
+            </w:pPr>
+            <w:r>
+              <w:rPr>
+                <w:rtl w:val="0"/>
+              </w:rPr>
+              <w:t xml:space="preserve">Title</w:t>
+            </w:r>
+          </w:p>
+        </w:tc>
+        <w:tc>
+          <w:tcPr>
+            <w:shd w:fill="auto" w:val="clear"/>
+            <w:tcMar>
+              <w:top w:w="100.0" w:type="dxa"/>
+              <w:left w:w="100.0" w:type="dxa"/>
+              <w:bottom w:w="100.0" w:type="dxa"/>
+              <w:right w:w="100.0" w:type="dxa"/>
+            </w:tcMar>
+            <w:vAlign w:val="top"/>
+          </w:tcPr>
+          <w:p>
+            <w:pPr>
+              <w:widowControl w:val="0"/>
+              <w:spacing w:line="240" w:lineRule="auto"/>
+              <w:rPr/>
+            </w:pPr>
+            <w:r>
+              <w:rPr>
+                <w:rtl w:val="0"/>
+              </w:rPr>
+              <w:t xml:space="preserve">Actual Result</w:t>
+            </w:r>
+          </w:p>
+        </w:tc>
+        <w:tc>
+          <w:tcPr>
+            <w:shd w:fill="auto" w:val="clear"/>
+            <w:tcMar>
+              <w:top w:w="100.0" w:type="dxa"/>
+              <w:left w:w="100.0" w:type="dxa"/>
+              <w:bottom w:w="100.0" w:type="dxa"/>
+              <w:right w:w="100.0" w:type="dxa"/>
+            </w:tcMar>
+            <w:vAlign w:val="top"/>
+          </w:tcPr>
+          <w:p>
+            <w:pPr>
+              <w:widowControl w:val="0"/>
+              <w:spacing w:line="240" w:lineRule="auto"/>
+              <w:rPr/>
+            </w:pPr>
+            <w:r>
+              <w:rPr>
+                <w:rtl w:val="0"/>
+              </w:rPr>
+              <w:t xml:space="preserve">Status</w:t>
+            </w:r>
+          </w:p>
+        </w:tc>
+      </w:tr>
+      <w:tr>
+        <w:trPr>
+          <w:cantSplit w:val="0"/>
+          <w:tblHeader w:val="0"/>
+        </w:trPr>
+        <w:tc>
+          <w:tcPr>
+            <w:shd w:fill="auto" w:val="clear"/>
+            <w:tcMar>
+              <w:top w:w="100.0" w:type="dxa"/>
+              <w:left w:w="100.0" w:type="dxa"/>
+              <w:bottom w:w="100.0" w:type="dxa"/>
+              <w:right w:w="100.0" w:type="dxa"/>
+            </w:tcMar>
+            <w:vAlign w:val="top"/>
+          </w:tcPr>
+          <w:p>
+            <w:pPr>
+              <w:widowControl w:val="0"/>
+              <w:spacing w:line="240" w:lineRule="auto"/>
+              <w:rPr/>
+            </w:pPr>
+            <w:r>
+              <w:rPr>
+                <w:rtl w:val="0"/>
+              </w:rPr>
+              <w:t xml:space="preserve">TC1</w:t>
+            </w:r>
+          </w:p>
+        </w:tc>
+        <w:tc>
+          <w:tcPr>
+            <w:shd w:fill="auto" w:val="clear"/>
+            <w:tcMar>
+              <w:top w:w="100.0" w:type="dxa"/>
+              <w:left w:w="100.0" w:type="dxa"/>
+              <w:bottom w:w="100.0" w:type="dxa"/>
+              <w:right w:w="100.0" w:type="dxa"/>
+            </w:tcMar>
+            <w:vAlign w:val="top"/>
+          </w:tcPr>
+          <w:p>
+            <w:pPr>
+              <w:widowControl w:val="0"/>
+              <w:spacing w:line="240" w:lineRule="auto"/>
+              <w:rPr/>
+            </w:pPr>
+            <w:r>
+              <w:rPr>
+                <w:rtl w:val="0"/>
+              </w:rPr>
+              <w:t xml:space="preserve">Login</w:t>
+            </w:r>
+          </w:p>
+        </w:tc>
+        <w:tc>
+          <w:tcPr>
+            <w:shd w:fill="auto" w:val="clear"/>
+            <w:tcMar>
+              <w:top w:w="100.0" w:type="dxa"/>
+              <w:left w:w="100.0" w:type="dxa"/>
+              <w:bottom w:w="100.0" w:type="dxa"/>
+              <w:right w:w="100.0" w:type="dxa"/>
+            </w:tcMar>
+            <w:vAlign w:val="top"/>
+          </w:tcPr>
+          <w:p>
+            <w:pPr>
+              <w:widowControl w:val="0"/>
+              <w:spacing w:line="240" w:lineRule="auto"/>
+              <w:rPr/>
+            </w:pPr>
+            <w:r>
+              <w:rPr>
+                <w:rtl w:val="0"/>
+              </w:rPr>
+              <w:t xml:space="preserve">Valid login</w:t>
+            </w:r>
+          </w:p>
+        </w:tc>
+        <w:tc>
+          <w:tcPr>
+            <w:shd w:fill="auto" w:val="clear"/>
+            <w:tcMar>
+              <w:top w:w="100.0" w:type="dxa"/>
+              <w:left w:w="100.0" w:type="dxa"/>
+              <w:bottom w:w="100.0" w:type="dxa"/>
+              <w:right w:w="100.0" w:type="dxa"/>
+            </w:tcMar>
+            <w:vAlign w:val="top"/>
+          </w:tcPr>
+          <w:p>
+            <w:pPr>
+              <w:widowControl w:val="0"/>
+              <w:spacing w:line="240" w:lineRule="auto"/>
+              <w:rPr/>
+            </w:pPr>
+            <w:r>
+              <w:rPr>
+                <w:rtl w:val="0"/>
+              </w:rPr>
+              <w:t xml:space="preserve">Successfully login</w:t>
+            </w:r>
+          </w:p>
+        </w:tc>
+        <w:tc>
+          <w:tcPr>
+            <w:shd w:fill="auto" w:val="clear"/>
+            <w:tcMar>
+              <w:top w:w="100.0" w:type="dxa"/>
+              <w:left w:w="100.0" w:type="dxa"/>
+              <w:bottom w:w="100.0" w:type="dxa"/>
+              <w:right w:w="100.0" w:type="dxa"/>
+            </w:tcMar>
+            <w:vAlign w:val="top"/>
+          </w:tcPr>
+          <w:p>
+            <w:pPr>
+              <w:widowControl w:val="0"/>
+              <w:spacing w:line="240" w:lineRule="auto"/>
+              <w:rPr/>
+            </w:pPr>
+            <w:r>
+              <w:rPr>
+                <w:rtl w:val="0"/>
+              </w:rPr>
+              <w:t xml:space="preserve">Pass</w:t>
+            </w:r>
+          </w:p>
+        </w:tc>
+      </w:tr>
+      <w:tr>
+        <w:trPr>
+          <w:cantSplit w:val="0"/>
+          <w:tblHeader w:val="0"/>
+        </w:trPr>
+        <w:tc>
+          <w:tcPr>
+            <w:shd w:fill="auto" w:val="clear"/>
+            <w:tcMar>
+              <w:top w:w="100.0" w:type="dxa"/>
+              <w:left w:w="100.0" w:type="dxa"/>
+              <w:bottom w:w="100.0" w:type="dxa"/>
+              <w:right w:w="100.0" w:type="dxa"/>
+            </w:tcMar>
+            <w:vAlign w:val="top"/>
+          </w:tcPr>
+          <w:p>
+            <w:pPr>
+              <w:widowControl w:val="0"/>
+              <w:spacing w:line="240" w:lineRule="auto"/>
+              <w:rPr/>
+            </w:pPr>
+            <w:r>
+              <w:rPr>
+                <w:rtl w:val="0"/>
+              </w:rPr>
+              <w:t xml:space="preserve">TC2</w:t>
+            </w:r>
+          </w:p>
+        </w:tc>
+        <w:tc>
+          <w:tcPr>
+            <w:shd w:fill="auto" w:val="clear"/>
+            <w:tcMar>
+              <w:top w:w="100.0" w:type="dxa"/>
+              <w:left w:w="100.0" w:type="dxa"/>
+              <w:bottom w:w="100.0" w:type="dxa"/>
+              <w:right w:w="100.0" w:type="dxa"/>
+            </w:tcMar>
+            <w:vAlign w:val="top"/>
+          </w:tcPr>
+          <w:p>
+            <w:pPr>
+              <w:widowControl w:val="0"/>
+              <w:spacing w:line="240" w:lineRule="auto"/>
+              <w:rPr/>
+            </w:pPr>
+            <w:r>
+              <w:rPr>
+                <w:rtl w:val="0"/>
+              </w:rPr>
+              <w:t xml:space="preserve">Login</w:t>
+            </w:r>
+          </w:p>
+        </w:tc>
+        <w:tc>
+          <w:tcPr>
+            <w:shd w:fill="auto" w:val="clear"/>
+            <w:tcMar>
+              <w:top w:w="100.0" w:type="dxa"/>
+              <w:left w:w="100.0" w:type="dxa"/>
+              <w:bottom w:w="100.0" w:type="dxa"/>
+              <w:right w:w="100.0" w:type="dxa"/>
+            </w:tcMar>
+            <w:vAlign w:val="top"/>
+          </w:tcPr>
+          <w:p>
+            <w:pPr>
+              <w:widowControl w:val="0"/>
+              <w:spacing w:line="240" w:lineRule="auto"/>
+              <w:rPr/>
+            </w:pPr>
+            <w:r>
+              <w:rPr>
+                <w:rtl w:val="0"/>
+              </w:rPr>
+              <w:t xml:space="preserve">Invalid login</w:t>
+            </w:r>
+          </w:p>
+        </w:tc>
+        <w:tc>
+          <w:tcPr>
+            <w:shd w:fill="auto" w:val="clear"/>
+            <w:tcMar>
+              <w:top w:w="100.0" w:type="dxa"/>
+              <w:left w:w="100.0" w:type="dxa"/>
+              <w:bottom w:w="100.0" w:type="dxa"/>
+              <w:right w:w="100.0" w:type="dxa"/>
+            </w:tcMar>
+            <w:vAlign w:val="top"/>
+          </w:tcPr>
+          <w:p>
+            <w:pPr>
+              <w:widowControl w:val="0"/>
+              <w:spacing w:line="240" w:lineRule="auto"/>
+              <w:rPr/>
+            </w:pPr>
+            <w:r>
+              <w:rPr>
+                <w:rtl w:val="0"/>
+              </w:rPr>
+              <w:t xml:space="preserve">Error “Invalid password”</w:t>
+            </w:r>
+          </w:p>
+        </w:tc>
+        <w:tc>
+          <w:tcPr>
+            <w:shd w:fill="auto" w:val="clear"/>
+            <w:tcMar>
+              <w:top w:w="100.0" w:type="dxa"/>
+              <w:left w:w="100.0" w:type="dxa"/>
+              <w:bottom w:w="100.0" w:type="dxa"/>
+              <w:right w:w="100.0" w:type="dxa"/>
+            </w:tcMar>
+            <w:vAlign w:val="top"/>
+          </w:tcPr>
+          <w:p>
+            <w:pPr>
+              <w:widowControl w:val="0"/>
+              <w:spacing w:line="240" w:lineRule="auto"/>
+              <w:rPr/>
+            </w:pPr>
+            <w:r>
+              <w:rPr>
+                <w:rtl w:val="0"/>
+              </w:rPr>
+              <w:t xml:space="preserve">Pass</w:t>
+            </w:r>
+          </w:p>
+        </w:tc>
+      </w:tr>
+      <w:tr>
+        <w:trPr>
+          <w:cantSplit w:val="0"/>
+          <w:tblHeader w:val="0"/>
+        </w:trPr>
+        <w:tc>
+          <w:tcPr>
+            <w:shd w:fill="auto" w:val="clear"/>
+            <w:tcMar>
+              <w:top w:w="100.0" w:type="dxa"/>
+              <w:left w:w="100.0" w:type="dxa"/>
+              <w:bottom w:w="100.0" w:type="dxa"/>
+              <w:right w:w="100.0" w:type="dxa"/>
+            </w:tcMar>
+            <w:vAlign w:val="top"/>
+          </w:tcPr>
+          <w:p>
+            <w:pPr>
+              <w:widowControl w:val="0"/>
+              <w:spacing w:line="240" w:lineRule="auto"/>
+              <w:rPr/>
+            </w:pPr>
+            <w:r>
+              <w:rPr>
+                <w:rtl w:val="0"/>
+              </w:rPr>
+              <w:t xml:space="preserve">TC3</w:t>
+            </w:r>
+          </w:p>
+        </w:tc>
+        <w:tc>
+          <w:tcPr>
+            <w:shd w:fill="auto" w:val="clear"/>
+            <w:tcMar>
+              <w:top w:w="100.0" w:type="dxa"/>
+              <w:left w:w="100.0" w:type="dxa"/>
+              <w:bottom w:w="100.0" w:type="dxa"/>
+              <w:right w:w="100.0" w:type="dxa"/>
+            </w:tcMar>
+            <w:vAlign w:val="top"/>
+          </w:tcPr>
+          <w:p>
+            <w:pPr>
+              <w:widowControl w:val="0"/>
+              <w:spacing w:line="240" w:lineRule="auto"/>
+              <w:rPr/>
+            </w:pPr>
+            <w:r>
+              <w:rPr>
+                <w:rtl w:val="0"/>
+              </w:rPr>
+              <w:t xml:space="preserve">Admin</w:t>
+            </w:r>
+          </w:p>
+        </w:tc>
+        <w:tc>
+          <w:tcPr>
+            <w:shd w:fill="auto" w:val="clear"/>
+            <w:tcMar>
+              <w:top w:w="100.0" w:type="dxa"/>
+              <w:left w:w="100.0" w:type="dxa"/>
+              <w:bottom w:w="100.0" w:type="dxa"/>
+              <w:right w:w="100.0" w:type="dxa"/>
+            </w:tcMar>
+            <w:vAlign w:val="top"/>
+          </w:tcPr>
+          <w:p>
+            <w:pPr>
+              <w:widowControl w:val="0"/>
+              <w:spacing w:line="240" w:lineRule="auto"/>
+              <w:rPr/>
+            </w:pPr>
+            <w:r>
+              <w:rPr>
+                <w:rtl w:val="0"/>
+              </w:rPr>
+              <w:t xml:space="preserve">Add user</w:t>
+            </w:r>
+          </w:p>
+        </w:tc>
+        <w:tc>
+          <w:tcPr>
+            <w:shd w:fill="auto" w:val="clear"/>
+            <w:tcMar>
+              <w:top w:w="100.0" w:type="dxa"/>
+              <w:left w:w="100.0" w:type="dxa"/>
+              <w:bottom w:w="100.0" w:type="dxa"/>
+              <w:right w:w="100.0" w:type="dxa"/>
+            </w:tcMar>
+            <w:vAlign w:val="top"/>
+          </w:tcPr>
+          <w:p>
+            <w:pPr>
+              <w:widowControl w:val="0"/>
+              <w:spacing w:line="240" w:lineRule="auto"/>
+              <w:rPr/>
+            </w:pPr>
+            <w:r>
+              <w:rPr>
+                <w:rtl w:val="0"/>
+              </w:rPr>
+              <w:t xml:space="preserve">User added successfully</w:t>
+            </w:r>
+          </w:p>
+        </w:tc>
+        <w:tc>
+          <w:tcPr>
+            <w:shd w:fill="auto" w:val="clear"/>
+            <w:tcMar>
+              <w:top w:w="100.0" w:type="dxa"/>
+              <w:left w:w="100.0" w:type="dxa"/>
+              <w:bottom w:w="100.0" w:type="dxa"/>
+              <w:right w:w="100.0" w:type="dxa"/>
+            </w:tcMar>
+            <w:vAlign w:val="top"/>
+          </w:tcPr>
+          <w:p>
+            <w:pPr>
+              <w:widowControl w:val="0"/>
+              <w:spacing w:line="240" w:lineRule="auto"/>
+              <w:rPr/>
+            </w:pPr>
+            <w:r>
+              <w:rPr>
+                <w:rtl w:val="0"/>
+              </w:rPr>
+              <w:t xml:space="preserve">Pass</w:t>
+            </w:r>
+          </w:p>
+        </w:tc>
+      </w:tr>
+      <w:tr>
+        <w:trPr>
+          <w:cantSplit w:val="0"/>
+          <w:tblHeader w:val="0"/>
+        </w:trPr>
+        <w:tc>
+          <w:tcPr>
+            <w:shd w:fill="auto" w:val="clear"/>
+            <w:tcMar>
+              <w:top w:w="100.0" w:type="dxa"/>
+              <w:left w:w="100.0" w:type="dxa"/>
+              <w:bottom w:w="100.0" w:type="dxa"/>
+              <w:right w:w="100.0" w:type="dxa"/>
+            </w:tcMar>
+            <w:vAlign w:val="top"/>
+          </w:tcPr>
+          <w:p>
+            <w:pPr>
+              <w:widowControl w:val="0"/>
+              <w:spacing w:line="240" w:lineRule="auto"/>
+              <w:rPr/>
+            </w:pPr>
+            <w:r>
+              <w:rPr>
+                <w:rtl w:val="0"/>
+              </w:rPr>
+              <w:t xml:space="preserve">TC4</w:t>
+            </w:r>
+          </w:p>
+        </w:tc>
+        <w:tc>
+          <w:tcPr>
+            <w:shd w:fill="auto" w:val="clear"/>
+            <w:tcMar>
+              <w:top w:w="100.0" w:type="dxa"/>
+              <w:left w:w="100.0" w:type="dxa"/>
+              <w:bottom w:w="100.0" w:type="dxa"/>
+              <w:right w:w="100.0" w:type="dxa"/>
+            </w:tcMar>
+            <w:vAlign w:val="top"/>
+          </w:tcPr>
+          <w:p>
+            <w:pPr>
+              <w:widowControl w:val="0"/>
+              <w:spacing w:line="240" w:lineRule="auto"/>
+              <w:rPr/>
+            </w:pPr>
+            <w:r>
+              <w:rPr>
+                <w:rtl w:val="0"/>
+              </w:rPr>
+              <w:t xml:space="preserve">Leave</w:t>
+            </w:r>
+          </w:p>
+        </w:tc>
+        <w:tc>
+          <w:tcPr>
+            <w:shd w:fill="auto" w:val="clear"/>
+            <w:tcMar>
+              <w:top w:w="100.0" w:type="dxa"/>
+              <w:left w:w="100.0" w:type="dxa"/>
+              <w:bottom w:w="100.0" w:type="dxa"/>
+              <w:right w:w="100.0" w:type="dxa"/>
+            </w:tcMar>
+            <w:vAlign w:val="top"/>
+          </w:tcPr>
+          <w:p>
+            <w:pPr>
+              <w:widowControl w:val="0"/>
+              <w:spacing w:line="240" w:lineRule="auto"/>
+              <w:rPr/>
+            </w:pPr>
+            <w:r>
+              <w:rPr>
+                <w:rtl w:val="0"/>
+              </w:rPr>
+              <w:t xml:space="preserve">Apply for leave</w:t>
+            </w:r>
+          </w:p>
+        </w:tc>
+        <w:tc>
+          <w:tcPr>
+            <w:shd w:fill="auto" w:val="clear"/>
+            <w:tcMar>
+              <w:top w:w="100.0" w:type="dxa"/>
+              <w:left w:w="100.0" w:type="dxa"/>
+              <w:bottom w:w="100.0" w:type="dxa"/>
+              <w:right w:w="100.0" w:type="dxa"/>
+            </w:tcMar>
+            <w:vAlign w:val="top"/>
+          </w:tcPr>
+          <w:p>
+            <w:pPr>
+              <w:widowControl w:val="0"/>
+              <w:spacing w:line="240" w:lineRule="auto"/>
+              <w:rPr/>
+            </w:pPr>
+            <w:r>
+              <w:rPr>
+                <w:rtl w:val="0"/>
+              </w:rPr>
+              <w:t xml:space="preserve">No Leave Type exists</w:t>
+            </w:r>
+          </w:p>
+        </w:tc>
+        <w:tc>
+          <w:tcPr>
+            <w:shd w:fill="auto" w:val="clear"/>
+            <w:tcMar>
+              <w:top w:w="100.0" w:type="dxa"/>
+              <w:left w:w="100.0" w:type="dxa"/>
+              <w:bottom w:w="100.0" w:type="dxa"/>
+              <w:right w:w="100.0" w:type="dxa"/>
+            </w:tcMar>
+            <w:vAlign w:val="top"/>
+          </w:tcPr>
+          <w:p>
+            <w:pPr>
+              <w:widowControl w:val="0"/>
+              <w:spacing w:line="240" w:lineRule="auto"/>
+              <w:rPr/>
+            </w:pPr>
+            <w:r>
+              <w:rPr>
+                <w:rtl w:val="0"/>
+              </w:rPr>
+              <w:t xml:space="preserve">Fail</w:t>
+            </w:r>
+          </w:p>
+        </w:tc>
+      </w:tr>
+      <w:tr>
+        <w:trPr>
+          <w:cantSplit w:val="0"/>
+          <w:tblHeader w:val="0"/>
+        </w:trPr>
+        <w:tc>
+          <w:tcPr>
+            <w:shd w:fill="auto" w:val="clear"/>
+            <w:tcMar>
+              <w:top w:w="100.0" w:type="dxa"/>
+              <w:left w:w="100.0" w:type="dxa"/>
+              <w:bottom w:w="100.0" w:type="dxa"/>
+              <w:right w:w="100.0" w:type="dxa"/>
+            </w:tcMar>
+            <w:vAlign w:val="top"/>
+          </w:tcPr>
+          <w:p>
+            <w:pPr>
+              <w:widowControl w:val="0"/>
+              <w:spacing w:line="240" w:lineRule="auto"/>
+              <w:rPr/>
+            </w:pPr>
+            <w:r>
+              <w:rPr>
+                <w:rtl w:val="0"/>
+              </w:rPr>
+              <w:t xml:space="preserve">TC5</w:t>
+            </w:r>
+          </w:p>
+        </w:tc>
+        <w:tc>
+          <w:tcPr>
+            <w:shd w:fill="auto" w:val="clear"/>
+            <w:tcMar>
+              <w:top w:w="100.0" w:type="dxa"/>
+              <w:left w:w="100.0" w:type="dxa"/>
+              <w:bottom w:w="100.0" w:type="dxa"/>
+              <w:right w:w="100.0" w:type="dxa"/>
+            </w:tcMar>
+            <w:vAlign w:val="top"/>
+          </w:tcPr>
+          <w:p>
+            <w:pPr>
+              <w:widowControl w:val="0"/>
+              <w:spacing w:line="240" w:lineRule="auto"/>
+              <w:rPr/>
+            </w:pPr>
+            <w:r>
+              <w:rPr>
+                <w:rtl w:val="0"/>
+              </w:rPr>
+              <w:t xml:space="preserve">PIM</w:t>
+            </w:r>
+          </w:p>
+        </w:tc>
+        <w:tc>
+          <w:tcPr>
+            <w:shd w:fill="auto" w:val="clear"/>
+            <w:tcMar>
+              <w:top w:w="100.0" w:type="dxa"/>
+              <w:left w:w="100.0" w:type="dxa"/>
+              <w:bottom w:w="100.0" w:type="dxa"/>
+              <w:right w:w="100.0" w:type="dxa"/>
+            </w:tcMar>
+            <w:vAlign w:val="top"/>
+          </w:tcPr>
+          <w:p>
+            <w:pPr>
+              <w:widowControl w:val="0"/>
+              <w:spacing w:line="240" w:lineRule="auto"/>
+              <w:rPr/>
+            </w:pPr>
+            <w:r>
+              <w:rPr>
+                <w:rtl w:val="0"/>
+              </w:rPr>
+              <w:t xml:space="preserve">Add new employee</w:t>
+            </w:r>
+          </w:p>
+        </w:tc>
+        <w:tc>
+          <w:tcPr>
+            <w:shd w:fill="auto" w:val="clear"/>
+            <w:tcMar>
+              <w:top w:w="100.0" w:type="dxa"/>
+              <w:left w:w="100.0" w:type="dxa"/>
+              <w:bottom w:w="100.0" w:type="dxa"/>
+              <w:right w:w="100.0" w:type="dxa"/>
+            </w:tcMar>
+            <w:vAlign w:val="top"/>
+          </w:tcPr>
+          <w:p>
+            <w:pPr>
+              <w:widowControl w:val="0"/>
+              <w:spacing w:line="240" w:lineRule="auto"/>
+              <w:rPr/>
+            </w:pPr>
+            <w:r>
+              <w:rPr>
+                <w:rtl w:val="0"/>
+              </w:rPr>
+              <w:t xml:space="preserve">User added successfully</w:t>
+            </w:r>
+          </w:p>
+        </w:tc>
+        <w:tc>
+          <w:tcPr>
+            <w:shd w:fill="auto" w:val="clear"/>
+            <w:tcMar>
+              <w:top w:w="100.0" w:type="dxa"/>
+              <w:left w:w="100.0" w:type="dxa"/>
+              <w:bottom w:w="100.0" w:type="dxa"/>
+              <w:right w:w="100.0" w:type="dxa"/>
+            </w:tcMar>
+            <w:vAlign w:val="top"/>
+          </w:tcPr>
+          <w:p>
+            <w:pPr>
+              <w:widowControl w:val="0"/>
+              <w:spacing w:line="240" w:lineRule="auto"/>
+              <w:rPr/>
+            </w:pPr>
+            <w:r>
+              <w:rPr>
+                <w:rtl w:val="0"/>
+              </w:rPr>
+              <w:t xml:space="preserve">Pass</w:t>
+            </w:r>
+          </w:p>
+        </w:tc>
+      </w:tr>
+    </w:tbl>
     <w:p>
       <w:pPr>
         <w:rPr/>
@@ -4148,6 +6864,32 @@
     </w:rPr>
   </w:style>
   <w:style w:type="table" w:styleId="Table1">
+    <w:basedOn w:val="TableNormal"/>
+    <w:tblPr>
+      <w:tblStyleRowBandSize w:val="1"/>
+      <w:tblStyleColBandSize w:val="1"/>
+      <w:tblCellMar>
+        <w:top w:w="100.0" w:type="dxa"/>
+        <w:left w:w="100.0" w:type="dxa"/>
+        <w:bottom w:w="100.0" w:type="dxa"/>
+        <w:right w:w="100.0" w:type="dxa"/>
+      </w:tblCellMar>
+    </w:tblPr>
+  </w:style>
+  <w:style w:type="table" w:styleId="Table2">
+    <w:basedOn w:val="TableNormal"/>
+    <w:tblPr>
+      <w:tblStyleRowBandSize w:val="1"/>
+      <w:tblStyleColBandSize w:val="1"/>
+      <w:tblCellMar>
+        <w:top w:w="100.0" w:type="dxa"/>
+        <w:left w:w="100.0" w:type="dxa"/>
+        <w:bottom w:w="100.0" w:type="dxa"/>
+        <w:right w:w="100.0" w:type="dxa"/>
+      </w:tblCellMar>
+    </w:tblPr>
+  </w:style>
+  <w:style w:type="table" w:styleId="Table3">
     <w:basedOn w:val="TableNormal"/>
     <w:tblPr>
       <w:tblStyleRowBandSize w:val="1"/>

</xml_diff>